<commit_message>
feat: add a screenshot of each lab's application to the deck and Learner Guide
Captured each lab website with Playwright at 1440x900, with the chat widget
opened so the teaching point is visible in the image itself:

- Lab 1 — the n8n canvas (no website) plus a sample event flyer
- Lab 2 — Marina Trust Bank onboarding site
- Lab 3 — Investment Advisor, chat open showing the contact gate in action
- Lab 4 — Meridian portal, widget stating a licensed manager reviews every reply
- Lab 5 — Cook & Bake Academy with the course assistant open

Each lab now shows the APPLICATION before the WORKFLOW, so learners see what
they are building before how it is wired. image_slide() now fits the image to
whichever edge binds first and uses a tight caption band, so a wide screenshot
fills the slide instead of floating as a thumbnail.

Deck 161 -> 167 slides; slide_index updated and verified by the build assertion.

Co-Authored-By: Claude Opus 5 (1M context) <noreply@anthropic.com>
</commit_message>
<xml_diff>
--- a/courseware/LG-Agentic AI for Business Process Automation.docx
+++ b/courseware/LG-Agentic AI for Business Process Automation.docx
@@ -218,7 +218,7 @@
           <w:color w:val="1F6FEB"/>
           <w:sz w:val="24"/>
         </w:rPr>
-        <w:t>Version 1.1</w:t>
+        <w:t>Version 1.2</w:t>
       </w:r>
     </w:p>
     <w:p>
@@ -438,6 +438,64 @@
           </w:p>
         </w:tc>
       </w:tr>
+      <w:tr>
+        <w:tc>
+          <w:tcPr>
+            <w:tcW w:type="dxa" w:w="2160"/>
+          </w:tcPr>
+          <w:p>
+            <w:r/>
+            <w:r>
+              <w:rPr>
+                <w:sz w:val="19"/>
+              </w:rPr>
+              <w:t>1.2</w:t>
+            </w:r>
+          </w:p>
+        </w:tc>
+        <w:tc>
+          <w:tcPr>
+            <w:tcW w:type="dxa" w:w="2160"/>
+          </w:tcPr>
+          <w:p>
+            <w:r/>
+            <w:r>
+              <w:rPr>
+                <w:sz w:val="19"/>
+              </w:rPr>
+              <w:t>1 August 2026</w:t>
+            </w:r>
+          </w:p>
+        </w:tc>
+        <w:tc>
+          <w:tcPr>
+            <w:tcW w:type="dxa" w:w="2160"/>
+          </w:tcPr>
+          <w:p>
+            <w:r/>
+            <w:r>
+              <w:rPr>
+                <w:sz w:val="19"/>
+              </w:rPr>
+              <w:t>Added a screenshot of each lab's application — the four lab websites with their chat widgets open, plus the Lab 1 n8n canvas and sample flyer — to the slide deck and the Learner Guide.</w:t>
+            </w:r>
+          </w:p>
+        </w:tc>
+        <w:tc>
+          <w:tcPr>
+            <w:tcW w:type="dxa" w:w="2160"/>
+          </w:tcPr>
+          <w:p>
+            <w:r/>
+            <w:r>
+              <w:rPr>
+                <w:sz w:val="19"/>
+              </w:rPr>
+              <w:t>Dr. Alfred Ang</w:t>
+            </w:r>
+          </w:p>
+        </w:tc>
+      </w:tr>
     </w:tbl>
     <w:p>
       <w:r>
@@ -627,7 +685,7 @@
         </w:rPr>
         <w:t>Topic 02 — Agentic Chatbot and Human in the Loop</w:t>
         <w:tab/>
-        <w:t>14</w:t>
+        <w:t>16</w:t>
       </w:r>
     </w:p>
     <w:p>
@@ -647,7 +705,7 @@
         </w:rPr>
         <w:t>Lab 3 — Chatbot Webhook (Investment Advisor)</w:t>
         <w:tab/>
-        <w:t>15</w:t>
+        <w:t>16</w:t>
       </w:r>
     </w:p>
     <w:p>
@@ -667,7 +725,7 @@
         </w:rPr>
         <w:t>Lab 4 — Human in the Loop (Client Rapport Assistant)</w:t>
         <w:tab/>
-        <w:t>18</w:t>
+        <w:t>19</w:t>
       </w:r>
     </w:p>
     <w:p>
@@ -686,7 +744,7 @@
         </w:rPr>
         <w:t>Topic 03 — Retrieval-Augmented Generation (RAG)</w:t>
         <w:tab/>
-        <w:t>21</w:t>
+        <w:t>23</w:t>
       </w:r>
     </w:p>
     <w:p>
@@ -706,7 +764,7 @@
         </w:rPr>
         <w:t>Lab 5 — RAG Customer Care Chatbot (Cook &amp; Bake Academy)</w:t>
         <w:tab/>
-        <w:t>23</w:t>
+        <w:t>25</w:t>
       </w:r>
     </w:p>
     <w:p>
@@ -725,7 +783,7 @@
         </w:rPr>
         <w:t>Taking This Back to Work</w:t>
         <w:tab/>
-        <w:t>27</w:t>
+        <w:t>29</w:t>
       </w:r>
     </w:p>
     <w:p>
@@ -744,7 +802,7 @@
         </w:rPr>
         <w:t>Assessment</w:t>
         <w:tab/>
-        <w:t>27</w:t>
+        <w:t>30</w:t>
       </w:r>
     </w:p>
     <w:p>
@@ -763,7 +821,7 @@
         </w:rPr>
         <w:t>Glossary</w:t>
         <w:tab/>
-        <w:t>27</w:t>
+        <w:t>30</w:t>
       </w:r>
     </w:p>
     <w:p>
@@ -2589,7 +2647,7 @@
     </w:p>
     <w:p>
       <w:r>
-        <w:t>Workflow automation · Triggers &amp; actions · LLM agents · Webhooks   (Deck reference: Slides 29–75.)</w:t>
+        <w:t>Workflow automation · Triggers &amp; actions · LLM agents · Webhooks   (Deck reference: Slides 29–78.)</w:t>
       </w:r>
     </w:p>
     <w:p>
@@ -2729,7 +2787,7 @@
     </w:p>
     <w:p>
       <w:r>
-        <w:t>Deck reference: Slides 44–58.</w:t>
+        <w:t>Deck reference: Slides 44–60.</w:t>
       </w:r>
     </w:p>
     <w:p>
@@ -2769,8 +2827,112 @@
       <w:r>
         <w:drawing>
           <wp:inline xmlns:a="http://schemas.openxmlformats.org/drawingml/2006/main" xmlns:pic="http://schemas.openxmlformats.org/drawingml/2006/picture">
+            <wp:extent cx="5669280" cy="2381098"/>
+            <wp:docPr id="5" name="Picture 5"/>
+            <wp:cNvGraphicFramePr>
+              <a:graphicFrameLocks noChangeAspect="1"/>
+            </wp:cNvGraphicFramePr>
+            <a:graphic>
+              <a:graphicData uri="http://schemas.openxmlformats.org/drawingml/2006/picture">
+                <pic:pic>
+                  <pic:nvPicPr>
+                    <pic:cNvPr id="0" name="site-lab1.png"/>
+                    <pic:cNvPicPr/>
+                  </pic:nvPicPr>
+                  <pic:blipFill>
+                    <a:blip r:embed="rId13"/>
+                    <a:stretch>
+                      <a:fillRect/>
+                    </a:stretch>
+                  </pic:blipFill>
+                  <pic:spPr>
+                    <a:xfrm>
+                      <a:off x="0" y="0"/>
+                      <a:ext cx="5669280" cy="2381098"/>
+                    </a:xfrm>
+                    <a:prstGeom prst="rect"/>
+                  </pic:spPr>
+                </pic:pic>
+              </a:graphicData>
+            </a:graphic>
+          </wp:inline>
+        </w:drawing>
+      </w:r>
+    </w:p>
+    <w:p>
+      <w:pPr>
+        <w:jc w:val="center"/>
+      </w:pPr>
+      <w:r>
+        <w:rPr>
+          <w:i/>
+          <w:color w:val="555B66"/>
+          <w:sz w:val="18"/>
+        </w:rPr>
+        <w:t>The finished Lab 1 workflow on the n8n canvas — the Form Trigger fires on each submission and the Gmail node sends the details to the administrator.</w:t>
+      </w:r>
+    </w:p>
+    <w:p>
+      <w:pPr>
+        <w:jc w:val="center"/>
+      </w:pPr>
+      <w:r>
+        <w:drawing>
+          <wp:inline xmlns:a="http://schemas.openxmlformats.org/drawingml/2006/main" xmlns:pic="http://schemas.openxmlformats.org/drawingml/2006/picture">
+            <wp:extent cx="5669280" cy="3188970"/>
+            <wp:docPr id="6" name="Picture 6"/>
+            <wp:cNvGraphicFramePr>
+              <a:graphicFrameLocks noChangeAspect="1"/>
+            </wp:cNvGraphicFramePr>
+            <a:graphic>
+              <a:graphicData uri="http://schemas.openxmlformats.org/drawingml/2006/picture">
+                <pic:pic>
+                  <pic:nvPicPr>
+                    <pic:cNvPr id="0" name="site-lab1-flyer.png"/>
+                    <pic:cNvPicPr/>
+                  </pic:nvPicPr>
+                  <pic:blipFill>
+                    <a:blip r:embed="rId14"/>
+                    <a:stretch>
+                      <a:fillRect/>
+                    </a:stretch>
+                  </pic:blipFill>
+                  <pic:spPr>
+                    <a:xfrm>
+                      <a:off x="0" y="0"/>
+                      <a:ext cx="5669280" cy="3188970"/>
+                    </a:xfrm>
+                    <a:prstGeom prst="rect"/>
+                  </pic:spPr>
+                </pic:pic>
+              </a:graphicData>
+            </a:graphic>
+          </wp:inline>
+        </w:drawing>
+      </w:r>
+    </w:p>
+    <w:p>
+      <w:pPr>
+        <w:jc w:val="center"/>
+      </w:pPr>
+      <w:r>
+        <w:rPr>
+          <w:i/>
+          <w:color w:val="555B66"/>
+          <w:sz w:val="18"/>
+        </w:rPr>
+        <w:t>A sample event flyer from a previous class. The QR code encodes the form's Production URL, so anyone can sign up by scanning it with a phone.</w:t>
+      </w:r>
+    </w:p>
+    <w:p>
+      <w:pPr>
+        <w:jc w:val="center"/>
+      </w:pPr>
+      <w:r>
+        <w:drawing>
+          <wp:inline xmlns:a="http://schemas.openxmlformats.org/drawingml/2006/main" xmlns:pic="http://schemas.openxmlformats.org/drawingml/2006/picture">
             <wp:extent cx="5669280" cy="680314"/>
-            <wp:docPr id="5" name="Picture 5"/>
+            <wp:docPr id="7" name="Picture 7"/>
             <wp:cNvGraphicFramePr>
               <a:graphicFrameLocks noChangeAspect="1"/>
             </wp:cNvGraphicFramePr>
@@ -2782,7 +2944,7 @@
                     <pic:cNvPicPr/>
                   </pic:nvPicPr>
                   <pic:blipFill>
-                    <a:blip r:embed="rId13"/>
+                    <a:blip r:embed="rId15"/>
                     <a:stretch>
                       <a:fillRect/>
                     </a:stretch>
@@ -3416,7 +3578,7 @@
     </w:p>
     <w:p>
       <w:r>
-        <w:t>Deck reference: Slides 59–74.</w:t>
+        <w:t>Deck reference: Slides 61–77.</w:t>
       </w:r>
     </w:p>
     <w:p>
@@ -3456,8 +3618,60 @@
       <w:r>
         <w:drawing>
           <wp:inline xmlns:a="http://schemas.openxmlformats.org/drawingml/2006/main" xmlns:pic="http://schemas.openxmlformats.org/drawingml/2006/picture">
+            <wp:extent cx="5669280" cy="3543300"/>
+            <wp:docPr id="8" name="Picture 8"/>
+            <wp:cNvGraphicFramePr>
+              <a:graphicFrameLocks noChangeAspect="1"/>
+            </wp:cNvGraphicFramePr>
+            <a:graphic>
+              <a:graphicData uri="http://schemas.openxmlformats.org/drawingml/2006/picture">
+                <pic:pic>
+                  <pic:nvPicPr>
+                    <pic:cNvPr id="0" name="site-lab2.png"/>
+                    <pic:cNvPicPr/>
+                  </pic:nvPicPr>
+                  <pic:blipFill>
+                    <a:blip r:embed="rId16"/>
+                    <a:stretch>
+                      <a:fillRect/>
+                    </a:stretch>
+                  </pic:blipFill>
+                  <pic:spPr>
+                    <a:xfrm>
+                      <a:off x="0" y="0"/>
+                      <a:ext cx="5669280" cy="3543300"/>
+                    </a:xfrm>
+                    <a:prstGeom prst="rect"/>
+                  </pic:spPr>
+                </pic:pic>
+              </a:graphicData>
+            </a:graphic>
+          </wp:inline>
+        </w:drawing>
+      </w:r>
+    </w:p>
+    <w:p>
+      <w:pPr>
+        <w:jc w:val="center"/>
+      </w:pPr>
+      <w:r>
+        <w:rPr>
+          <w:i/>
+          <w:color w:val="555B66"/>
+          <w:sz w:val="18"/>
+        </w:rPr>
+        <w:t>The Marina Trust Bank site the webhook sits behind. The applicant submits here, the AI Agent decides, and the page renders the decision as a coloured card.</w:t>
+      </w:r>
+    </w:p>
+    <w:p>
+      <w:pPr>
+        <w:jc w:val="center"/>
+      </w:pPr>
+      <w:r>
+        <w:drawing>
+          <wp:inline xmlns:a="http://schemas.openxmlformats.org/drawingml/2006/main" xmlns:pic="http://schemas.openxmlformats.org/drawingml/2006/picture">
             <wp:extent cx="5669280" cy="937321"/>
-            <wp:docPr id="6" name="Picture 6"/>
+            <wp:docPr id="9" name="Picture 9"/>
             <wp:cNvGraphicFramePr>
               <a:graphicFrameLocks noChangeAspect="1"/>
             </wp:cNvGraphicFramePr>
@@ -3469,7 +3683,7 @@
                     <pic:cNvPicPr/>
                   </pic:nvPicPr>
                   <pic:blipFill>
-                    <a:blip r:embed="rId14"/>
+                    <a:blip r:embed="rId17"/>
                     <a:stretch>
                       <a:fillRect/>
                     </a:stretch>
@@ -4198,7 +4412,7 @@
     </w:p>
     <w:p>
       <w:r>
-        <w:t>Agentic workflows · Chatbots on webhooks · Approval gates · Accountability   (Deck reference: Slides 76–120.)</w:t>
+        <w:t>Agentic workflows · Chatbots on webhooks · Approval gates · Accountability   (Deck reference: Slides 79–125.)</w:t>
       </w:r>
     </w:p>
     <w:p>
@@ -4324,7 +4538,7 @@
     </w:p>
     <w:p>
       <w:r>
-        <w:t>Deck reference: Slides 87–101.</w:t>
+        <w:t>Deck reference: Slides 90–105.</w:t>
       </w:r>
     </w:p>
     <w:p>
@@ -4364,8 +4578,60 @@
       <w:r>
         <w:drawing>
           <wp:inline xmlns:a="http://schemas.openxmlformats.org/drawingml/2006/main" xmlns:pic="http://schemas.openxmlformats.org/drawingml/2006/picture">
+            <wp:extent cx="5669280" cy="3543300"/>
+            <wp:docPr id="10" name="Picture 10"/>
+            <wp:cNvGraphicFramePr>
+              <a:graphicFrameLocks noChangeAspect="1"/>
+            </wp:cNvGraphicFramePr>
+            <a:graphic>
+              <a:graphicData uri="http://schemas.openxmlformats.org/drawingml/2006/picture">
+                <pic:pic>
+                  <pic:nvPicPr>
+                    <pic:cNvPr id="0" name="site-lab3.png"/>
+                    <pic:cNvPicPr/>
+                  </pic:nvPicPr>
+                  <pic:blipFill>
+                    <a:blip r:embed="rId18"/>
+                    <a:stretch>
+                      <a:fillRect/>
+                    </a:stretch>
+                  </pic:blipFill>
+                  <pic:spPr>
+                    <a:xfrm>
+                      <a:off x="0" y="0"/>
+                      <a:ext cx="5669280" cy="3543300"/>
+                    </a:xfrm>
+                    <a:prstGeom prst="rect"/>
+                  </pic:spPr>
+                </pic:pic>
+              </a:graphicData>
+            </a:graphic>
+          </wp:inline>
+        </w:drawing>
+      </w:r>
+    </w:p>
+    <w:p>
+      <w:pPr>
+        <w:jc w:val="center"/>
+      </w:pPr>
+      <w:r>
+        <w:rPr>
+          <w:i/>
+          <w:color w:val="555B66"/>
+          <w:sz w:val="18"/>
+        </w:rPr>
+        <w:t>The Investment Advisor site with the chat widget open. Note the contact gate in action — it asks for the visitor's name before it will answer anything.</w:t>
+      </w:r>
+    </w:p>
+    <w:p>
+      <w:pPr>
+        <w:jc w:val="center"/>
+      </w:pPr>
+      <w:r>
+        <w:drawing>
+          <wp:inline xmlns:a="http://schemas.openxmlformats.org/drawingml/2006/main" xmlns:pic="http://schemas.openxmlformats.org/drawingml/2006/picture">
             <wp:extent cx="5669280" cy="534532"/>
-            <wp:docPr id="7" name="Picture 7"/>
+            <wp:docPr id="11" name="Picture 11"/>
             <wp:cNvGraphicFramePr>
               <a:graphicFrameLocks noChangeAspect="1"/>
             </wp:cNvGraphicFramePr>
@@ -4377,7 +4643,7 @@
                     <pic:cNvPicPr/>
                   </pic:nvPicPr>
                   <pic:blipFill>
-                    <a:blip r:embed="rId15"/>
+                    <a:blip r:embed="rId19"/>
                     <a:stretch>
                       <a:fillRect/>
                     </a:stretch>
@@ -5060,7 +5326,7 @@
     </w:p>
     <w:p>
       <w:r>
-        <w:t>Deck reference: Slides 102–119.</w:t>
+        <w:t>Deck reference: Slides 106–124.</w:t>
       </w:r>
     </w:p>
     <w:p>
@@ -5100,8 +5366,60 @@
       <w:r>
         <w:drawing>
           <wp:inline xmlns:a="http://schemas.openxmlformats.org/drawingml/2006/main" xmlns:pic="http://schemas.openxmlformats.org/drawingml/2006/picture">
+            <wp:extent cx="5669280" cy="3543300"/>
+            <wp:docPr id="12" name="Picture 12"/>
+            <wp:cNvGraphicFramePr>
+              <a:graphicFrameLocks noChangeAspect="1"/>
+            </wp:cNvGraphicFramePr>
+            <a:graphic>
+              <a:graphicData uri="http://schemas.openxmlformats.org/drawingml/2006/picture">
+                <pic:pic>
+                  <pic:nvPicPr>
+                    <pic:cNvPr id="0" name="site-lab4.png"/>
+                    <pic:cNvPicPr/>
+                  </pic:nvPicPr>
+                  <pic:blipFill>
+                    <a:blip r:embed="rId20"/>
+                    <a:stretch>
+                      <a:fillRect/>
+                    </a:stretch>
+                  </pic:blipFill>
+                  <pic:spPr>
+                    <a:xfrm>
+                      <a:off x="0" y="0"/>
+                      <a:ext cx="5669280" cy="3543300"/>
+                    </a:xfrm>
+                    <a:prstGeom prst="rect"/>
+                  </pic:spPr>
+                </pic:pic>
+              </a:graphicData>
+            </a:graphic>
+          </wp:inline>
+        </w:drawing>
+      </w:r>
+    </w:p>
+    <w:p>
+      <w:pPr>
+        <w:jc w:val="center"/>
+      </w:pPr>
+      <w:r>
+        <w:rPr>
+          <w:i/>
+          <w:color w:val="555B66"/>
+          <w:sz w:val="18"/>
+        </w:rPr>
+        <w:t>The Meridian client portal. The widget states plainly that a licensed manager reviews every reply — the human-in-the-loop promise made visible to the client.</w:t>
+      </w:r>
+    </w:p>
+    <w:p>
+      <w:pPr>
+        <w:jc w:val="center"/>
+      </w:pPr>
+      <w:r>
+        <w:drawing>
+          <wp:inline xmlns:a="http://schemas.openxmlformats.org/drawingml/2006/main" xmlns:pic="http://schemas.openxmlformats.org/drawingml/2006/picture">
             <wp:extent cx="5669280" cy="937321"/>
-            <wp:docPr id="8" name="Picture 8"/>
+            <wp:docPr id="13" name="Picture 13"/>
             <wp:cNvGraphicFramePr>
               <a:graphicFrameLocks noChangeAspect="1"/>
             </wp:cNvGraphicFramePr>
@@ -5113,7 +5431,7 @@
                     <pic:cNvPicPr/>
                   </pic:nvPicPr>
                   <pic:blipFill>
-                    <a:blip r:embed="rId16"/>
+                    <a:blip r:embed="rId21"/>
                     <a:stretch>
                       <a:fillRect/>
                     </a:stretch>
@@ -5912,7 +6230,7 @@
     </w:p>
     <w:p>
       <w:r>
-        <w:t>Tokenization · Embeddings · Vector stores · Grounded answers   (Deck reference: Slides 121–153.)</w:t>
+        <w:t>Tokenization · Embeddings · Vector stores · Grounded answers   (Deck reference: Slides 126–159.)</w:t>
       </w:r>
     </w:p>
     <w:p>
@@ -6031,7 +6349,7 @@
         <w:drawing>
           <wp:inline xmlns:a="http://schemas.openxmlformats.org/drawingml/2006/main" xmlns:pic="http://schemas.openxmlformats.org/drawingml/2006/picture">
             <wp:extent cx="5669280" cy="2914918"/>
-            <wp:docPr id="9" name="Picture 9"/>
+            <wp:docPr id="14" name="Picture 14"/>
             <wp:cNvGraphicFramePr>
               <a:graphicFrameLocks noChangeAspect="1"/>
             </wp:cNvGraphicFramePr>
@@ -6043,7 +6361,7 @@
                     <pic:cNvPicPr/>
                   </pic:nvPicPr>
                   <pic:blipFill>
-                    <a:blip r:embed="rId17"/>
+                    <a:blip r:embed="rId22"/>
                     <a:stretch>
                       <a:fillRect/>
                     </a:stretch>
@@ -6083,7 +6401,7 @@
         <w:drawing>
           <wp:inline xmlns:a="http://schemas.openxmlformats.org/drawingml/2006/main" xmlns:pic="http://schemas.openxmlformats.org/drawingml/2006/picture">
             <wp:extent cx="5669280" cy="1774418"/>
-            <wp:docPr id="10" name="Picture 10"/>
+            <wp:docPr id="15" name="Picture 15"/>
             <wp:cNvGraphicFramePr>
               <a:graphicFrameLocks noChangeAspect="1"/>
             </wp:cNvGraphicFramePr>
@@ -6095,7 +6413,7 @@
                     <pic:cNvPicPr/>
                   </pic:nvPicPr>
                   <pic:blipFill>
-                    <a:blip r:embed="rId18"/>
+                    <a:blip r:embed="rId23"/>
                     <a:stretch>
                       <a:fillRect/>
                     </a:stretch>
@@ -6135,7 +6453,7 @@
         <w:drawing>
           <wp:inline xmlns:a="http://schemas.openxmlformats.org/drawingml/2006/main" xmlns:pic="http://schemas.openxmlformats.org/drawingml/2006/picture">
             <wp:extent cx="5669280" cy="3188970"/>
-            <wp:docPr id="11" name="Picture 11"/>
+            <wp:docPr id="16" name="Picture 16"/>
             <wp:cNvGraphicFramePr>
               <a:graphicFrameLocks noChangeAspect="1"/>
             </wp:cNvGraphicFramePr>
@@ -6147,7 +6465,7 @@
                     <pic:cNvPicPr/>
                   </pic:nvPicPr>
                   <pic:blipFill>
-                    <a:blip r:embed="rId19"/>
+                    <a:blip r:embed="rId24"/>
                     <a:stretch>
                       <a:fillRect/>
                     </a:stretch>
@@ -6194,7 +6512,7 @@
     </w:p>
     <w:p>
       <w:r>
-        <w:t>Deck reference: Slides 133–152.</w:t>
+        <w:t>Deck reference: Slides 138–158.</w:t>
       </w:r>
     </w:p>
     <w:p>
@@ -6234,8 +6552,60 @@
       <w:r>
         <w:drawing>
           <wp:inline xmlns:a="http://schemas.openxmlformats.org/drawingml/2006/main" xmlns:pic="http://schemas.openxmlformats.org/drawingml/2006/picture">
+            <wp:extent cx="5669280" cy="3543300"/>
+            <wp:docPr id="17" name="Picture 17"/>
+            <wp:cNvGraphicFramePr>
+              <a:graphicFrameLocks noChangeAspect="1"/>
+            </wp:cNvGraphicFramePr>
+            <a:graphic>
+              <a:graphicData uri="http://schemas.openxmlformats.org/drawingml/2006/picture">
+                <pic:pic>
+                  <pic:nvPicPr>
+                    <pic:cNvPr id="0" name="site-lab5.png"/>
+                    <pic:cNvPicPr/>
+                  </pic:nvPicPr>
+                  <pic:blipFill>
+                    <a:blip r:embed="rId25"/>
+                    <a:stretch>
+                      <a:fillRect/>
+                    </a:stretch>
+                  </pic:blipFill>
+                  <pic:spPr>
+                    <a:xfrm>
+                      <a:off x="0" y="0"/>
+                      <a:ext cx="5669280" cy="3543300"/>
+                    </a:xfrm>
+                    <a:prstGeom prst="rect"/>
+                  </pic:spPr>
+                </pic:pic>
+              </a:graphicData>
+            </a:graphic>
+          </wp:inline>
+        </w:drawing>
+      </w:r>
+    </w:p>
+    <w:p>
+      <w:pPr>
+        <w:jc w:val="center"/>
+      </w:pPr>
+      <w:r>
+        <w:rPr>
+          <w:i/>
+          <w:color w:val="555B66"/>
+          <w:sz w:val="18"/>
+        </w:rPr>
+        <w:t>The Cook &amp; Bake Academy site with the course assistant open. Every answer it gives is grounded in the 20 brochures you ingested into the vector store.</w:t>
+      </w:r>
+    </w:p>
+    <w:p>
+      <w:pPr>
+        <w:jc w:val="center"/>
+      </w:pPr>
+      <w:r>
+        <w:drawing>
+          <wp:inline xmlns:a="http://schemas.openxmlformats.org/drawingml/2006/main" xmlns:pic="http://schemas.openxmlformats.org/drawingml/2006/picture">
             <wp:extent cx="5669280" cy="969642"/>
-            <wp:docPr id="12" name="Picture 12"/>
+            <wp:docPr id="18" name="Picture 18"/>
             <wp:cNvGraphicFramePr>
               <a:graphicFrameLocks noChangeAspect="1"/>
             </wp:cNvGraphicFramePr>
@@ -6247,7 +6617,7 @@
                     <pic:cNvPicPr/>
                   </pic:nvPicPr>
                   <pic:blipFill>
-                    <a:blip r:embed="rId20"/>
+                    <a:blip r:embed="rId26"/>
                     <a:stretch>
                       <a:fillRect/>
                     </a:stretch>
@@ -6287,7 +6657,7 @@
         <w:drawing>
           <wp:inline xmlns:a="http://schemas.openxmlformats.org/drawingml/2006/main" xmlns:pic="http://schemas.openxmlformats.org/drawingml/2006/picture">
             <wp:extent cx="5669280" cy="1124785"/>
-            <wp:docPr id="13" name="Picture 13"/>
+            <wp:docPr id="19" name="Picture 19"/>
             <wp:cNvGraphicFramePr>
               <a:graphicFrameLocks noChangeAspect="1"/>
             </wp:cNvGraphicFramePr>
@@ -6299,7 +6669,7 @@
                     <pic:cNvPicPr/>
                   </pic:nvPicPr>
                   <pic:blipFill>
-                    <a:blip r:embed="rId21"/>
+                    <a:blip r:embed="rId27"/>
                     <a:stretch>
                       <a:fillRect/>
                     </a:stretch>
@@ -7521,7 +7891,7 @@
       </w:r>
     </w:p>
     <w:sectPr>
-      <w:footerReference w:type="default" r:id="rId22"/>
+      <w:footerReference w:type="default" r:id="rId28"/>
       <w:pgSz w:w="12240" w:h="15840"/>
       <w:pgMar w:top="1440" w:right="1800" w:bottom="1440" w:left="1800" w:header="720" w:footer="720" w:gutter="0"/>
       <w:cols w:space="720"/>

</xml_diff>

<commit_message>
feat(courseware): v2.1 — workflow-first Topic 1 opener, AI security, n8n training accounts
Topic 1 now opens with a brief history of AI 2023–2026, agentic AI vs AI
agents, workflow first vs AI first, the trend of building workflows with
Claude Code and Codex, the 5 principles of AI security, why workflow first
is more secure, and the business value of workflow-first agentic
automation. The separate Foundation section is folded into Topic 1.

Adds an n8n Training Accounts slide. The password is read from the
gitignored .env and is never committed; the public deck shows a
placeholder (PUBLIC_BUILD=1).

Also fixes the Lesson Plan overview slide (Topic 2 / Lab 3 belong to
Day 2) and standardizes the README.

Co-Authored-By: Claude Opus 5.5 <noreply@anthropic.com>
</commit_message>
<xml_diff>
--- a/courseware/LG-Agentic AI for Business Process Automation.docx
+++ b/courseware/LG-Agentic AI for Business Process Automation.docx
@@ -218,7 +218,7 @@
           <w:color w:val="1F6FEB"/>
           <w:sz w:val="24"/>
         </w:rPr>
-        <w:t>Version 2.0</w:t>
+        <w:t>Version 2.1</w:t>
       </w:r>
     </w:p>
     <w:p>
@@ -554,6 +554,64 @@
           </w:p>
         </w:tc>
       </w:tr>
+      <w:tr>
+        <w:tc>
+          <w:tcPr>
+            <w:tcW w:type="dxa" w:w="2160"/>
+          </w:tcPr>
+          <w:p>
+            <w:r/>
+            <w:r>
+              <w:rPr>
+                <w:sz w:val="19"/>
+              </w:rPr>
+              <w:t>2.1</w:t>
+            </w:r>
+          </w:p>
+        </w:tc>
+        <w:tc>
+          <w:tcPr>
+            <w:tcW w:type="dxa" w:w="2160"/>
+          </w:tcPr>
+          <w:p>
+            <w:r/>
+            <w:r>
+              <w:rPr>
+                <w:sz w:val="19"/>
+              </w:rPr>
+              <w:t>15 October 2026</w:t>
+            </w:r>
+          </w:p>
+        </w:tc>
+        <w:tc>
+          <w:tcPr>
+            <w:tcW w:type="dxa" w:w="2160"/>
+          </w:tcPr>
+          <w:p>
+            <w:r/>
+            <w:r>
+              <w:rPr>
+                <w:sz w:val="19"/>
+              </w:rPr>
+              <w:t>Topic 1 now opens with the modern view of agentic automation, replacing the separate Foundation section: a brief history of AI 2023–2026 (prompt, context and harness engineering to AI agents), agentic AI vs AI agents, workflow first vs AI first, the trend of using Claude Code and Codex to build workflows, the five principles of AI security and why workflow first is more secure, and the business value of workflow-first agentic automation.</w:t>
+            </w:r>
+          </w:p>
+        </w:tc>
+        <w:tc>
+          <w:tcPr>
+            <w:tcW w:type="dxa" w:w="2160"/>
+          </w:tcPr>
+          <w:p>
+            <w:r/>
+            <w:r>
+              <w:rPr>
+                <w:sz w:val="19"/>
+              </w:rPr>
+              <w:t>Dr. Alfred Ang</w:t>
+            </w:r>
+          </w:p>
+        </w:tc>
+      </w:tr>
     </w:tbl>
     <w:p>
       <w:pPr>
@@ -590,7 +648,7 @@
         </w:rPr>
         <w:t>Introduction</w:t>
         <w:tab/>
-        <w:t>4</w:t>
+        <w:t>5</w:t>
       </w:r>
     </w:p>
     <w:p>
@@ -609,7 +667,7 @@
         </w:rPr>
         <w:t>Course Learning Outcomes</w:t>
         <w:tab/>
-        <w:t>4</w:t>
+        <w:t>5</w:t>
       </w:r>
     </w:p>
     <w:p>
@@ -628,7 +686,7 @@
         </w:rPr>
         <w:t>Skills Framework Alignment</w:t>
         <w:tab/>
-        <w:t>4</w:t>
+        <w:t>5</w:t>
       </w:r>
     </w:p>
     <w:p>
@@ -647,25 +705,6 @@
         </w:rPr>
         <w:t>Before You Start — Environment Setup</w:t>
         <w:tab/>
-        <w:t>5</w:t>
-      </w:r>
-    </w:p>
-    <w:p>
-      <w:pPr>
-        <w:tabs>
-          <w:tab w:pos="9072" w:val="right" w:leader="dot"/>
-        </w:tabs>
-        <w:spacing w:after="60"/>
-      </w:pPr>
-      <w:r>
-        <w:rPr>
-          <w:rFonts w:ascii="Arial" w:hAnsi="Arial"/>
-          <w:b/>
-          <w:color w:val="333333"/>
-          <w:sz w:val="22"/>
-        </w:rPr>
-        <w:t>Foundation — Agentic AI in Business Process Automation</w:t>
-        <w:tab/>
         <w:t>6</w:t>
       </w:r>
     </w:p>
@@ -685,7 +724,27 @@
         </w:rPr>
         <w:t>Topic 01 — Overview of n8n and AI Agents</w:t>
         <w:tab/>
-        <w:t>8</w:t>
+        <w:t>7</w:t>
+      </w:r>
+    </w:p>
+    <w:p>
+      <w:pPr>
+        <w:tabs>
+          <w:tab w:pos="9072" w:val="right" w:leader="dot"/>
+        </w:tabs>
+        <w:spacing w:after="60"/>
+        <w:ind w:left="432"/>
+      </w:pPr>
+      <w:r>
+        <w:rPr>
+          <w:rFonts w:ascii="Arial" w:hAnsi="Arial"/>
+          <w:b w:val="0"/>
+          <w:color w:val="333333"/>
+          <w:sz w:val="21"/>
+        </w:rPr>
+        <w:t>Why Agentic AI, and Why Workflow First</w:t>
+        <w:tab/>
+        <w:t>7</w:t>
       </w:r>
     </w:p>
     <w:p>
@@ -705,7 +764,7 @@
         </w:rPr>
         <w:t>Lab 1 — n8n Trigger and Action (Event Flyer with QR Code)</w:t>
         <w:tab/>
-        <w:t>12</w:t>
+        <w:t>14</w:t>
       </w:r>
     </w:p>
     <w:p>
@@ -725,7 +784,7 @@
         </w:rPr>
         <w:t>Lab 2 — Webhook and AI Agent (Marina Trust Bank Onboarding)</w:t>
         <w:tab/>
-        <w:t>15</w:t>
+        <w:t>18</w:t>
       </w:r>
     </w:p>
     <w:p>
@@ -744,7 +803,7 @@
         </w:rPr>
         <w:t>Topic 02 — Agentic Chatbot and Human in the Loop</w:t>
         <w:tab/>
-        <w:t>19</w:t>
+        <w:t>21</w:t>
       </w:r>
     </w:p>
     <w:p>
@@ -764,7 +823,7 @@
         </w:rPr>
         <w:t>Lab 3 — Chatbot Webhook (Investment Advisor)</w:t>
         <w:tab/>
-        <w:t>20</w:t>
+        <w:t>23</w:t>
       </w:r>
     </w:p>
     <w:p>
@@ -784,7 +843,7 @@
         </w:rPr>
         <w:t>Lab 4 — Human in the Loop (Client Rapport Assistant)</w:t>
         <w:tab/>
-        <w:t>23</w:t>
+        <w:t>26</w:t>
       </w:r>
     </w:p>
     <w:p>
@@ -803,7 +862,7 @@
         </w:rPr>
         <w:t>Topic 03 — Retrieval-Augmented Generation (RAG)</w:t>
         <w:tab/>
-        <w:t>27</w:t>
+        <w:t>30</w:t>
       </w:r>
     </w:p>
     <w:p>
@@ -823,7 +882,7 @@
         </w:rPr>
         <w:t>Lab 5 — RAG Customer Care Chatbot (Cook &amp; Bake Academy)</w:t>
         <w:tab/>
-        <w:t>30</w:t>
+        <w:t>32</w:t>
       </w:r>
     </w:p>
     <w:p>
@@ -842,7 +901,7 @@
         </w:rPr>
         <w:t>Taking This Back to Work</w:t>
         <w:tab/>
-        <w:t>35</w:t>
+        <w:t>37</w:t>
       </w:r>
     </w:p>
     <w:p>
@@ -861,7 +920,7 @@
         </w:rPr>
         <w:t>Assessment</w:t>
         <w:tab/>
-        <w:t>35</w:t>
+        <w:t>37</w:t>
       </w:r>
     </w:p>
     <w:p>
@@ -880,7 +939,7 @@
         </w:rPr>
         <w:t>Glossary</w:t>
         <w:tab/>
-        <w:t>35</w:t>
+        <w:t>37</w:t>
       </w:r>
     </w:p>
     <w:p>
@@ -1975,7 +2034,25 @@
         <w:pStyle w:val="Heading1"/>
       </w:pPr>
       <w:r>
-        <w:t>Foundation — Agentic AI in Business Process Automation</w:t>
+        <w:t>Topic 01 — Overview of n8n and AI Agents</w:t>
+      </w:r>
+    </w:p>
+    <w:p>
+      <w:r>
+        <w:t>Why agentic AI · Workflow first · Triggers &amp; actions · LLM agents · Webhooks   (Deck reference: Slides 21–68.)</w:t>
+      </w:r>
+    </w:p>
+    <w:p>
+      <w:pPr>
+        <w:pStyle w:val="Heading2"/>
+      </w:pPr>
+      <w:r>
+        <w:t>Why Agentic AI, and Why Workflow First</w:t>
+      </w:r>
+    </w:p>
+    <w:p>
+      <w:r>
+        <w:t>Deck reference: Slides 21–30.</w:t>
       </w:r>
     </w:p>
     <w:p>
@@ -1985,12 +2062,258 @@
           <w:color w:val="1F6FEB"/>
           <w:sz w:val="22"/>
         </w:rPr>
-        <w:t>The evolution of AI</w:t>
-      </w:r>
-    </w:p>
-    <w:p>
-      <w:r>
-        <w:t>Artificial Intelligence began in the 1950s with Turing's test and rule-based symbolic systems. Machine Learning in the 1990s shifted the field from hand-written rules to learning patterns from data. Deep Learning in the 2000s added neural networks trained on large datasets. The 2017 Transformer architecture and its attention mechanism produced the Generative AI of the 2020s. Agentic AI, from around 2024, is the current step: models given goals, tools and memory, which plan and act rather than answer once.</w:t>
+        <w:t>A brief history of AI, 2023–2026</w:t>
+      </w:r>
+    </w:p>
+    <w:tbl>
+      <w:tblPr>
+        <w:tblStyle w:val="TableGrid"/>
+        <w:tblW w:type="auto" w:w="0"/>
+        <w:tblLook w:firstColumn="1" w:firstRow="1" w:lastColumn="0" w:lastRow="0" w:noHBand="0" w:noVBand="1" w:val="04A0"/>
+      </w:tblPr>
+      <w:tblGrid>
+        <w:gridCol w:w="2880"/>
+        <w:gridCol w:w="2880"/>
+        <w:gridCol w:w="2880"/>
+      </w:tblGrid>
+      <w:tr>
+        <w:tc>
+          <w:tcPr>
+            <w:tcW w:type="dxa" w:w="2880"/>
+            <w:shd w:val="clear" w:color="auto" w:fill="1F6FEB"/>
+          </w:tcPr>
+          <w:p>
+            <w:r/>
+            <w:r>
+              <w:rPr>
+                <w:b/>
+                <w:color w:val="FFFFFF"/>
+                <w:sz w:val="19"/>
+              </w:rPr>
+              <w:t>Year</w:t>
+            </w:r>
+          </w:p>
+        </w:tc>
+        <w:tc>
+          <w:tcPr>
+            <w:tcW w:type="dxa" w:w="2880"/>
+            <w:shd w:val="clear" w:color="auto" w:fill="1F6FEB"/>
+          </w:tcPr>
+          <w:p>
+            <w:r/>
+            <w:r>
+              <w:rPr>
+                <w:b/>
+                <w:color w:val="FFFFFF"/>
+                <w:sz w:val="19"/>
+              </w:rPr>
+              <w:t>Era</w:t>
+            </w:r>
+          </w:p>
+        </w:tc>
+        <w:tc>
+          <w:tcPr>
+            <w:tcW w:type="dxa" w:w="2880"/>
+            <w:shd w:val="clear" w:color="auto" w:fill="1F6FEB"/>
+          </w:tcPr>
+          <w:p>
+            <w:r/>
+            <w:r>
+              <w:rPr>
+                <w:b/>
+                <w:color w:val="FFFFFF"/>
+                <w:sz w:val="19"/>
+              </w:rPr>
+              <w:t>What changed</w:t>
+            </w:r>
+          </w:p>
+        </w:tc>
+      </w:tr>
+      <w:tr>
+        <w:tc>
+          <w:tcPr>
+            <w:tcW w:type="dxa" w:w="2880"/>
+          </w:tcPr>
+          <w:p>
+            <w:r/>
+            <w:r>
+              <w:rPr>
+                <w:b/>
+                <w:sz w:val="19"/>
+              </w:rPr>
+              <w:t>2023</w:t>
+            </w:r>
+          </w:p>
+        </w:tc>
+        <w:tc>
+          <w:tcPr>
+            <w:tcW w:type="dxa" w:w="2880"/>
+          </w:tcPr>
+          <w:p>
+            <w:r/>
+            <w:r>
+              <w:rPr>
+                <w:sz w:val="19"/>
+              </w:rPr>
+              <w:t>Prompt Engineering</w:t>
+            </w:r>
+          </w:p>
+        </w:tc>
+        <w:tc>
+          <w:tcPr>
+            <w:tcW w:type="dxa" w:w="2880"/>
+          </w:tcPr>
+          <w:p>
+            <w:r/>
+            <w:r>
+              <w:rPr>
+                <w:sz w:val="19"/>
+              </w:rPr>
+              <w:t>ChatGPT goes mainstream. Results depend on how well you word the prompt.</w:t>
+            </w:r>
+          </w:p>
+        </w:tc>
+      </w:tr>
+      <w:tr>
+        <w:tc>
+          <w:tcPr>
+            <w:tcW w:type="dxa" w:w="2880"/>
+          </w:tcPr>
+          <w:p>
+            <w:r/>
+            <w:r>
+              <w:rPr>
+                <w:b/>
+                <w:sz w:val="19"/>
+              </w:rPr>
+              <w:t>2024</w:t>
+            </w:r>
+          </w:p>
+        </w:tc>
+        <w:tc>
+          <w:tcPr>
+            <w:tcW w:type="dxa" w:w="2880"/>
+          </w:tcPr>
+          <w:p>
+            <w:r/>
+            <w:r>
+              <w:rPr>
+                <w:sz w:val="19"/>
+              </w:rPr>
+              <w:t>Context Engineering</w:t>
+            </w:r>
+          </w:p>
+        </w:tc>
+        <w:tc>
+          <w:tcPr>
+            <w:tcW w:type="dxa" w:w="2880"/>
+          </w:tcPr>
+          <w:p>
+            <w:r/>
+            <w:r>
+              <w:rPr>
+                <w:sz w:val="19"/>
+              </w:rPr>
+              <w:t>Models call tools and MCP launches. Results depend on the documents, data and tools you supply.</w:t>
+            </w:r>
+          </w:p>
+        </w:tc>
+      </w:tr>
+      <w:tr>
+        <w:tc>
+          <w:tcPr>
+            <w:tcW w:type="dxa" w:w="2880"/>
+          </w:tcPr>
+          <w:p>
+            <w:r/>
+            <w:r>
+              <w:rPr>
+                <w:b/>
+                <w:sz w:val="19"/>
+              </w:rPr>
+              <w:t>2025</w:t>
+            </w:r>
+          </w:p>
+        </w:tc>
+        <w:tc>
+          <w:tcPr>
+            <w:tcW w:type="dxa" w:w="2880"/>
+          </w:tcPr>
+          <w:p>
+            <w:r/>
+            <w:r>
+              <w:rPr>
+                <w:sz w:val="19"/>
+              </w:rPr>
+              <w:t>Harness Engineering</w:t>
+            </w:r>
+          </w:p>
+        </w:tc>
+        <w:tc>
+          <w:tcPr>
+            <w:tcW w:type="dxa" w:w="2880"/>
+          </w:tcPr>
+          <w:p>
+            <w:r/>
+            <w:r>
+              <w:rPr>
+                <w:sz w:val="19"/>
+              </w:rPr>
+              <w:t>Claude Code and Codex: systems built around the model that plan, act and check their own work in a loop.</w:t>
+            </w:r>
+          </w:p>
+        </w:tc>
+      </w:tr>
+      <w:tr>
+        <w:tc>
+          <w:tcPr>
+            <w:tcW w:type="dxa" w:w="2880"/>
+          </w:tcPr>
+          <w:p>
+            <w:r/>
+            <w:r>
+              <w:rPr>
+                <w:b/>
+                <w:sz w:val="19"/>
+              </w:rPr>
+              <w:t>2026</w:t>
+            </w:r>
+          </w:p>
+        </w:tc>
+        <w:tc>
+          <w:tcPr>
+            <w:tcW w:type="dxa" w:w="2880"/>
+          </w:tcPr>
+          <w:p>
+            <w:r/>
+            <w:r>
+              <w:rPr>
+                <w:sz w:val="19"/>
+              </w:rPr>
+              <w:t>AI Agents</w:t>
+            </w:r>
+          </w:p>
+        </w:tc>
+        <w:tc>
+          <w:tcPr>
+            <w:tcW w:type="dxa" w:w="2880"/>
+          </w:tcPr>
+          <w:p>
+            <w:r/>
+            <w:r>
+              <w:rPr>
+                <w:sz w:val="19"/>
+              </w:rPr>
+              <w:t>Always-on agents work 24/7 — OpenClaw, Hermes Agent and agent teams take on whole jobs.</w:t>
+            </w:r>
+          </w:p>
+        </w:tc>
+      </w:tr>
+    </w:tbl>
+    <w:p/>
+    <w:p>
+      <w:r>
+        <w:t>Each year moved the skill that matters: from wording one prompt, to curating the context, to engineering the harness around the model, to AI agents that work around the clock.</w:t>
       </w:r>
     </w:p>
     <w:p>
@@ -2367,64 +2690,12 @@
           <w:color w:val="1F6FEB"/>
           <w:sz w:val="22"/>
         </w:rPr>
-        <w:t>From RPA to Agentic Process Automation</w:t>
-      </w:r>
-    </w:p>
-    <w:p>
-      <w:r>
-        <w:t>Robotic Process Automation (RPA) follows a rigid path that a person constructs by hand — every branch is wired in advance, and anything unforeseen breaks it. Agentic Process Automation (APA) lets an agent orchestrate the workflow, so it can handle both rigid and flexible tasks.</w:t>
-      </w:r>
-    </w:p>
-    <w:p>
-      <w:pPr>
-        <w:jc w:val="center"/>
-      </w:pPr>
-      <w:r>
-        <w:drawing>
-          <wp:inline xmlns:a="http://schemas.openxmlformats.org/drawingml/2006/main" xmlns:pic="http://schemas.openxmlformats.org/drawingml/2006/picture">
-            <wp:extent cx="5669280" cy="2257213"/>
-            <wp:docPr id="4" name="Picture 4"/>
-            <wp:cNvGraphicFramePr>
-              <a:graphicFrameLocks noChangeAspect="1"/>
-            </wp:cNvGraphicFramePr>
-            <a:graphic>
-              <a:graphicData uri="http://schemas.openxmlformats.org/drawingml/2006/picture">
-                <pic:pic>
-                  <pic:nvPicPr>
-                    <pic:cNvPr id="0" name="rpa-to-apa.png"/>
-                    <pic:cNvPicPr/>
-                  </pic:nvPicPr>
-                  <pic:blipFill>
-                    <a:blip r:embed="rId12"/>
-                    <a:stretch>
-                      <a:fillRect/>
-                    </a:stretch>
-                  </pic:blipFill>
-                  <pic:spPr>
-                    <a:xfrm>
-                      <a:off x="0" y="0"/>
-                      <a:ext cx="5669280" cy="2257213"/>
-                    </a:xfrm>
-                    <a:prstGeom prst="rect"/>
-                  </pic:spPr>
-                </pic:pic>
-              </a:graphicData>
-            </a:graphic>
-          </wp:inline>
-        </w:drawing>
-      </w:r>
-    </w:p>
-    <w:p>
-      <w:pPr>
-        <w:jc w:val="center"/>
-      </w:pPr>
-      <w:r>
-        <w:rPr>
-          <w:i/>
-          <w:color w:val="555B66"/>
-          <w:sz w:val="18"/>
-        </w:rPr>
-        <w:t>RPA constructs the workflow manually and can only handle rigid tasks; APA orchestrates it automatically and handles flexible ones too.</w:t>
+        <w:t>Agentic AI vs AI agents</w:t>
+      </w:r>
+    </w:p>
+    <w:p>
+      <w:r>
+        <w:t>The two terms are often used loosely; in this course they mean different things. AGENTIC AI is the umbrella term for the whole system — any system in which AI pursues a goal over many steps, planning, acting through tools, checking the result and adapting. It includes the orchestration, the data, the guardrails and the human approvals, and it can be built as a workflow with AI steps or around one or more agents. An AI AGENT is one building block inside it: a single LLM given a goal, tools, memory and instructions, which decides its own next step in a loop and chooses which tool to call and when. In n8n that is the AI Agent node with its Chat Model, Memory and Tools. The best agentic systems use agents only where judgement is needed.</w:t>
       </w:r>
     </w:p>
     <w:p>
@@ -2434,7 +2705,989 @@
           <w:color w:val="1F6FEB"/>
           <w:sz w:val="22"/>
         </w:rPr>
-        <w:t>Business value</w:t>
+        <w:t>Workflow first vs AI first</w:t>
+      </w:r>
+    </w:p>
+    <w:p>
+      <w:r>
+        <w:t>There are two ways to build agentic automation. WORKFLOW FIRST is the modern form of rule-based (RPA-style) automation: you design the path, and AI is added only at the steps that need judgement. AI FIRST hands the path to an AI agent, which decides the steps and tools at run time.</w:t>
+      </w:r>
+    </w:p>
+    <w:tbl>
+      <w:tblPr>
+        <w:tblStyle w:val="TableGrid"/>
+        <w:tblW w:type="auto" w:w="0"/>
+        <w:tblLook w:firstColumn="1" w:firstRow="1" w:lastColumn="0" w:lastRow="0" w:noHBand="0" w:noVBand="1" w:val="04A0"/>
+      </w:tblPr>
+      <w:tblGrid>
+        <w:gridCol w:w="2880"/>
+        <w:gridCol w:w="2880"/>
+        <w:gridCol w:w="2880"/>
+      </w:tblGrid>
+      <w:tr>
+        <w:tc>
+          <w:tcPr>
+            <w:tcW w:type="dxa" w:w="2880"/>
+            <w:shd w:val="clear" w:color="auto" w:fill="1F6FEB"/>
+          </w:tcPr>
+          <w:p>
+            <w:r/>
+            <w:r>
+              <w:rPr>
+                <w:b/>
+                <w:color w:val="FFFFFF"/>
+                <w:sz w:val="19"/>
+              </w:rPr>
+            </w:r>
+          </w:p>
+        </w:tc>
+        <w:tc>
+          <w:tcPr>
+            <w:tcW w:type="dxa" w:w="2880"/>
+            <w:shd w:val="clear" w:color="auto" w:fill="1F6FEB"/>
+          </w:tcPr>
+          <w:p>
+            <w:r/>
+            <w:r>
+              <w:rPr>
+                <w:b/>
+                <w:color w:val="FFFFFF"/>
+                <w:sz w:val="19"/>
+              </w:rPr>
+              <w:t>Workflow First</w:t>
+            </w:r>
+          </w:p>
+        </w:tc>
+        <w:tc>
+          <w:tcPr>
+            <w:tcW w:type="dxa" w:w="2880"/>
+            <w:shd w:val="clear" w:color="auto" w:fill="1F6FEB"/>
+          </w:tcPr>
+          <w:p>
+            <w:r/>
+            <w:r>
+              <w:rPr>
+                <w:b/>
+                <w:color w:val="FFFFFF"/>
+                <w:sz w:val="19"/>
+              </w:rPr>
+              <w:t>AI First (AI Agent)</w:t>
+            </w:r>
+          </w:p>
+        </w:tc>
+      </w:tr>
+      <w:tr>
+        <w:tc>
+          <w:tcPr>
+            <w:tcW w:type="dxa" w:w="2880"/>
+          </w:tcPr>
+          <w:p>
+            <w:r/>
+            <w:r>
+              <w:rPr>
+                <w:b/>
+                <w:sz w:val="19"/>
+              </w:rPr>
+              <w:t>Who decides the path</w:t>
+            </w:r>
+          </w:p>
+        </w:tc>
+        <w:tc>
+          <w:tcPr>
+            <w:tcW w:type="dxa" w:w="2880"/>
+          </w:tcPr>
+          <w:p>
+            <w:r/>
+            <w:r>
+              <w:rPr>
+                <w:sz w:val="19"/>
+              </w:rPr>
+              <w:t>You design the steps; AI handles individual nodes</w:t>
+            </w:r>
+          </w:p>
+        </w:tc>
+        <w:tc>
+          <w:tcPr>
+            <w:tcW w:type="dxa" w:w="2880"/>
+          </w:tcPr>
+          <w:p>
+            <w:r/>
+            <w:r>
+              <w:rPr>
+                <w:sz w:val="19"/>
+              </w:rPr>
+              <w:t>The agent decides the steps and tools at run time</w:t>
+            </w:r>
+          </w:p>
+        </w:tc>
+      </w:tr>
+      <w:tr>
+        <w:tc>
+          <w:tcPr>
+            <w:tcW w:type="dxa" w:w="2880"/>
+          </w:tcPr>
+          <w:p>
+            <w:r/>
+            <w:r>
+              <w:rPr>
+                <w:b/>
+                <w:sz w:val="19"/>
+              </w:rPr>
+              <w:t>Behaviour</w:t>
+            </w:r>
+          </w:p>
+        </w:tc>
+        <w:tc>
+          <w:tcPr>
+            <w:tcW w:type="dxa" w:w="2880"/>
+          </w:tcPr>
+          <w:p>
+            <w:r/>
+            <w:r>
+              <w:rPr>
+                <w:sz w:val="19"/>
+              </w:rPr>
+              <w:t>Deterministic — same input, same path, every time</w:t>
+            </w:r>
+          </w:p>
+        </w:tc>
+        <w:tc>
+          <w:tcPr>
+            <w:tcW w:type="dxa" w:w="2880"/>
+          </w:tcPr>
+          <w:p>
+            <w:r/>
+            <w:r>
+              <w:rPr>
+                <w:sz w:val="19"/>
+              </w:rPr>
+              <w:t>Probabilistic — the path can change between runs</w:t>
+            </w:r>
+          </w:p>
+        </w:tc>
+      </w:tr>
+      <w:tr>
+        <w:tc>
+          <w:tcPr>
+            <w:tcW w:type="dxa" w:w="2880"/>
+          </w:tcPr>
+          <w:p>
+            <w:r/>
+            <w:r>
+              <w:rPr>
+                <w:b/>
+                <w:sz w:val="19"/>
+              </w:rPr>
+              <w:t>Efficiency</w:t>
+            </w:r>
+          </w:p>
+        </w:tc>
+        <w:tc>
+          <w:tcPr>
+            <w:tcW w:type="dxa" w:w="2880"/>
+          </w:tcPr>
+          <w:p>
+            <w:r/>
+            <w:r>
+              <w:rPr>
+                <w:sz w:val="19"/>
+              </w:rPr>
+              <w:t>More effort to design every branch up front</w:t>
+            </w:r>
+          </w:p>
+        </w:tc>
+        <w:tc>
+          <w:tcPr>
+            <w:tcW w:type="dxa" w:w="2880"/>
+          </w:tcPr>
+          <w:p>
+            <w:r/>
+            <w:r>
+              <w:rPr>
+                <w:sz w:val="19"/>
+              </w:rPr>
+              <w:t>Efficient — one instruction replaces many hand-built branches</w:t>
+            </w:r>
+          </w:p>
+        </w:tc>
+      </w:tr>
+      <w:tr>
+        <w:tc>
+          <w:tcPr>
+            <w:tcW w:type="dxa" w:w="2880"/>
+          </w:tcPr>
+          <w:p>
+            <w:r/>
+            <w:r>
+              <w:rPr>
+                <w:b/>
+                <w:sz w:val="19"/>
+              </w:rPr>
+              <w:t>Reliability &amp; testing</w:t>
+            </w:r>
+          </w:p>
+        </w:tc>
+        <w:tc>
+          <w:tcPr>
+            <w:tcW w:type="dxa" w:w="2880"/>
+          </w:tcPr>
+          <w:p>
+            <w:r/>
+            <w:r>
+              <w:rPr>
+                <w:sz w:val="19"/>
+              </w:rPr>
+              <w:t>Easy to test, debug and certify step by step</w:t>
+            </w:r>
+          </w:p>
+        </w:tc>
+        <w:tc>
+          <w:tcPr>
+            <w:tcW w:type="dxa" w:w="2880"/>
+          </w:tcPr>
+          <w:p>
+            <w:r/>
+            <w:r>
+              <w:rPr>
+                <w:sz w:val="19"/>
+              </w:rPr>
+              <w:t>Harder to test; edge cases surface in production</w:t>
+            </w:r>
+          </w:p>
+        </w:tc>
+      </w:tr>
+      <w:tr>
+        <w:tc>
+          <w:tcPr>
+            <w:tcW w:type="dxa" w:w="2880"/>
+          </w:tcPr>
+          <w:p>
+            <w:r/>
+            <w:r>
+              <w:rPr>
+                <w:b/>
+                <w:sz w:val="19"/>
+              </w:rPr>
+              <w:t>Cost &amp; speed</w:t>
+            </w:r>
+          </w:p>
+        </w:tc>
+        <w:tc>
+          <w:tcPr>
+            <w:tcW w:type="dxa" w:w="2880"/>
+          </w:tcPr>
+          <w:p>
+            <w:r/>
+            <w:r>
+              <w:rPr>
+                <w:sz w:val="19"/>
+              </w:rPr>
+              <w:t>An LLM call only where needed — cheap and fast</w:t>
+            </w:r>
+          </w:p>
+        </w:tc>
+        <w:tc>
+          <w:tcPr>
+            <w:tcW w:type="dxa" w:w="2880"/>
+          </w:tcPr>
+          <w:p>
+            <w:r/>
+            <w:r>
+              <w:rPr>
+                <w:sz w:val="19"/>
+              </w:rPr>
+              <w:t>An LLM call at every step — more tokens, more latency</w:t>
+            </w:r>
+          </w:p>
+        </w:tc>
+      </w:tr>
+      <w:tr>
+        <w:tc>
+          <w:tcPr>
+            <w:tcW w:type="dxa" w:w="2880"/>
+          </w:tcPr>
+          <w:p>
+            <w:r/>
+            <w:r>
+              <w:rPr>
+                <w:b/>
+                <w:sz w:val="19"/>
+              </w:rPr>
+              <w:t>Best for</w:t>
+            </w:r>
+          </w:p>
+        </w:tc>
+        <w:tc>
+          <w:tcPr>
+            <w:tcW w:type="dxa" w:w="2880"/>
+          </w:tcPr>
+          <w:p>
+            <w:r/>
+            <w:r>
+              <w:rPr>
+                <w:sz w:val="19"/>
+              </w:rPr>
+              <w:t>Repeatable, regulated, high-volume processes</w:t>
+            </w:r>
+          </w:p>
+        </w:tc>
+        <w:tc>
+          <w:tcPr>
+            <w:tcW w:type="dxa" w:w="2880"/>
+          </w:tcPr>
+          <w:p>
+            <w:r/>
+            <w:r>
+              <w:rPr>
+                <w:sz w:val="19"/>
+              </w:rPr>
+              <w:t>Open-ended tasks with unpredictable inputs</w:t>
+            </w:r>
+          </w:p>
+        </w:tc>
+      </w:tr>
+    </w:tbl>
+    <w:p/>
+    <w:p>
+      <w:r>
+        <w:t>Workflow first is more deterministic; AI first is more efficient. Because reliability matters most in business, companies try to make as much of a process deterministic as possible. (Source: n8n, In The Loop 2026 opening keynote and product direction.)</w:t>
+      </w:r>
+    </w:p>
+    <w:p>
+      <w:r>
+        <w:rPr>
+          <w:b/>
+          <w:color w:val="1F6FEB"/>
+          <w:sz w:val="22"/>
+        </w:rPr>
+        <w:t>The trend: AI agents build the workflow</w:t>
+      </w:r>
+    </w:p>
+    <w:p>
+      <w:r>
+        <w:t>AI-powered coding tools such as Claude Code and Codex are AI agents themselves, and they have made designing, building and changing workflows fast and cheap. The trend is therefore to use them to CREATE the workflow — describe the process in plain English, let Claude Code or Codex draft the n8n workflow, review and test it — and then let the deterministic workflow RUN the process, with AI nodes only where judgement is needed. The agent's efficiency goes into building, the workflow's determinism into running.</w:t>
+      </w:r>
+    </w:p>
+    <w:p>
+      <w:r>
+        <w:rPr>
+          <w:b/>
+          <w:color w:val="1F6FEB"/>
+          <w:sz w:val="22"/>
+        </w:rPr>
+        <w:t>The five principles of AI security</w:t>
+      </w:r>
+    </w:p>
+    <w:tbl>
+      <w:tblPr>
+        <w:tblStyle w:val="TableGrid"/>
+        <w:tblW w:type="auto" w:w="0"/>
+        <w:tblLook w:firstColumn="1" w:firstRow="1" w:lastColumn="0" w:lastRow="0" w:noHBand="0" w:noVBand="1" w:val="04A0"/>
+      </w:tblPr>
+      <w:tblGrid>
+        <w:gridCol w:w="2880"/>
+        <w:gridCol w:w="2880"/>
+        <w:gridCol w:w="2880"/>
+      </w:tblGrid>
+      <w:tr>
+        <w:tc>
+          <w:tcPr>
+            <w:tcW w:type="dxa" w:w="2880"/>
+            <w:shd w:val="clear" w:color="auto" w:fill="1F6FEB"/>
+          </w:tcPr>
+          <w:p>
+            <w:r/>
+            <w:r>
+              <w:rPr>
+                <w:b/>
+                <w:color w:val="FFFFFF"/>
+                <w:sz w:val="19"/>
+              </w:rPr>
+              <w:t>Principle</w:t>
+            </w:r>
+          </w:p>
+        </w:tc>
+        <w:tc>
+          <w:tcPr>
+            <w:tcW w:type="dxa" w:w="2880"/>
+            <w:shd w:val="clear" w:color="auto" w:fill="1F6FEB"/>
+          </w:tcPr>
+          <w:p>
+            <w:r/>
+            <w:r>
+              <w:rPr>
+                <w:b/>
+                <w:color w:val="FFFFFF"/>
+                <w:sz w:val="19"/>
+              </w:rPr>
+              <w:t>Controls</w:t>
+            </w:r>
+          </w:p>
+        </w:tc>
+        <w:tc>
+          <w:tcPr>
+            <w:tcW w:type="dxa" w:w="2880"/>
+            <w:shd w:val="clear" w:color="auto" w:fill="1F6FEB"/>
+          </w:tcPr>
+          <w:p>
+            <w:r/>
+            <w:r>
+              <w:rPr>
+                <w:b/>
+                <w:color w:val="FFFFFF"/>
+                <w:sz w:val="19"/>
+              </w:rPr>
+              <w:t>What it means</w:t>
+            </w:r>
+          </w:p>
+        </w:tc>
+      </w:tr>
+      <w:tr>
+        <w:tc>
+          <w:tcPr>
+            <w:tcW w:type="dxa" w:w="2880"/>
+          </w:tcPr>
+          <w:p>
+            <w:r/>
+            <w:r>
+              <w:rPr>
+                <w:b/>
+                <w:sz w:val="19"/>
+              </w:rPr>
+              <w:t>1. Data Control</w:t>
+            </w:r>
+          </w:p>
+        </w:tc>
+        <w:tc>
+          <w:tcPr>
+            <w:tcW w:type="dxa" w:w="2880"/>
+          </w:tcPr>
+          <w:p>
+            <w:r/>
+            <w:r>
+              <w:rPr>
+                <w:sz w:val="19"/>
+              </w:rPr>
+              <w:t>What AI can see</w:t>
+            </w:r>
+          </w:p>
+        </w:tc>
+        <w:tc>
+          <w:tcPr>
+            <w:tcW w:type="dxa" w:w="2880"/>
+          </w:tcPr>
+          <w:p>
+            <w:r/>
+            <w:r>
+              <w:rPr>
+                <w:sz w:val="19"/>
+              </w:rPr>
+              <w:t>Classify your data — public, internal, confidential — and decide exactly which data the AI may access.</w:t>
+            </w:r>
+          </w:p>
+        </w:tc>
+      </w:tr>
+      <w:tr>
+        <w:tc>
+          <w:tcPr>
+            <w:tcW w:type="dxa" w:w="2880"/>
+          </w:tcPr>
+          <w:p>
+            <w:r/>
+            <w:r>
+              <w:rPr>
+                <w:b/>
+                <w:sz w:val="19"/>
+              </w:rPr>
+              <w:t>2. Permission Control</w:t>
+            </w:r>
+          </w:p>
+        </w:tc>
+        <w:tc>
+          <w:tcPr>
+            <w:tcW w:type="dxa" w:w="2880"/>
+          </w:tcPr>
+          <w:p>
+            <w:r/>
+            <w:r>
+              <w:rPr>
+                <w:sz w:val="19"/>
+              </w:rPr>
+              <w:t>What AI can do</w:t>
+            </w:r>
+          </w:p>
+        </w:tc>
+        <w:tc>
+          <w:tcPr>
+            <w:tcW w:type="dxa" w:w="2880"/>
+          </w:tcPr>
+          <w:p>
+            <w:r/>
+            <w:r>
+              <w:rPr>
+                <w:sz w:val="19"/>
+              </w:rPr>
+              <w:t>Grant only the rights needed — read, write, edit, delete. Ask before anything destructive.</w:t>
+            </w:r>
+          </w:p>
+        </w:tc>
+      </w:tr>
+      <w:tr>
+        <w:tc>
+          <w:tcPr>
+            <w:tcW w:type="dxa" w:w="2880"/>
+          </w:tcPr>
+          <w:p>
+            <w:r/>
+            <w:r>
+              <w:rPr>
+                <w:b/>
+                <w:sz w:val="19"/>
+              </w:rPr>
+              <w:t>3. Human in the Loop</w:t>
+            </w:r>
+          </w:p>
+        </w:tc>
+        <w:tc>
+          <w:tcPr>
+            <w:tcW w:type="dxa" w:w="2880"/>
+          </w:tcPr>
+          <w:p>
+            <w:r/>
+            <w:r>
+              <w:rPr>
+                <w:sz w:val="19"/>
+              </w:rPr>
+              <w:t>Who approves</w:t>
+            </w:r>
+          </w:p>
+        </w:tc>
+        <w:tc>
+          <w:tcPr>
+            <w:tcW w:type="dxa" w:w="2880"/>
+          </w:tcPr>
+          <w:p>
+            <w:r/>
+            <w:r>
+              <w:rPr>
+                <w:sz w:val="19"/>
+              </w:rPr>
+              <w:t>A person reviews and approves high-impact actions — payments, deletions, customer emails.</w:t>
+            </w:r>
+          </w:p>
+        </w:tc>
+      </w:tr>
+      <w:tr>
+        <w:tc>
+          <w:tcPr>
+            <w:tcW w:type="dxa" w:w="2880"/>
+          </w:tcPr>
+          <w:p>
+            <w:r/>
+            <w:r>
+              <w:rPr>
+                <w:b/>
+                <w:sz w:val="19"/>
+              </w:rPr>
+              <w:t>4. Traceability</w:t>
+            </w:r>
+          </w:p>
+        </w:tc>
+        <w:tc>
+          <w:tcPr>
+            <w:tcW w:type="dxa" w:w="2880"/>
+          </w:tcPr>
+          <w:p>
+            <w:r/>
+            <w:r>
+              <w:rPr>
+                <w:sz w:val="19"/>
+              </w:rPr>
+              <w:t>What happened</w:t>
+            </w:r>
+          </w:p>
+        </w:tc>
+        <w:tc>
+          <w:tcPr>
+            <w:tcW w:type="dxa" w:w="2880"/>
+          </w:tcPr>
+          <w:p>
+            <w:r/>
+            <w:r>
+              <w:rPr>
+                <w:sz w:val="19"/>
+              </w:rPr>
+              <w:t>Log every prompt, tool call and change so actions can be audited, explained and rolled back.</w:t>
+            </w:r>
+          </w:p>
+        </w:tc>
+      </w:tr>
+      <w:tr>
+        <w:tc>
+          <w:tcPr>
+            <w:tcW w:type="dxa" w:w="2880"/>
+          </w:tcPr>
+          <w:p>
+            <w:r/>
+            <w:r>
+              <w:rPr>
+                <w:b/>
+                <w:sz w:val="19"/>
+              </w:rPr>
+              <w:t>5. Right-Sized Models</w:t>
+            </w:r>
+          </w:p>
+        </w:tc>
+        <w:tc>
+          <w:tcPr>
+            <w:tcW w:type="dxa" w:w="2880"/>
+          </w:tcPr>
+          <w:p>
+            <w:r/>
+            <w:r>
+              <w:rPr>
+                <w:sz w:val="19"/>
+              </w:rPr>
+              <w:t>Not the most powerful</w:t>
+            </w:r>
+          </w:p>
+        </w:tc>
+        <w:tc>
+          <w:tcPr>
+            <w:tcW w:type="dxa" w:w="2880"/>
+          </w:tcPr>
+          <w:p>
+            <w:r/>
+            <w:r>
+              <w:rPr>
+                <w:sz w:val="19"/>
+              </w:rPr>
+              <w:t>The smallest model that does the job carries less autonomy and less risk.</w:t>
+            </w:r>
+          </w:p>
+        </w:tc>
+      </w:tr>
+    </w:tbl>
+    <w:p/>
+    <w:p>
+      <w:r>
+        <w:t>In n8n these map to scoped credentials per node, approval gates (Gmail Send and Wait for Response), the Executions log, and a small model for each AI step.</w:t>
+      </w:r>
+    </w:p>
+    <w:p>
+      <w:r>
+        <w:rPr>
+          <w:b/>
+          <w:color w:val="1F6FEB"/>
+          <w:sz w:val="22"/>
+        </w:rPr>
+        <w:t>Why workflow first is more secure</w:t>
+      </w:r>
+    </w:p>
+    <w:p>
+      <w:r>
+        <w:t>A fixed path limits the blast radius: a manipulated AI step — for example one hit by a prompt injection — cannot reach tools that are not wired to it.</w:t>
+      </w:r>
+    </w:p>
+    <w:tbl>
+      <w:tblPr>
+        <w:tblStyle w:val="TableGrid"/>
+        <w:tblW w:type="auto" w:w="0"/>
+        <w:tblLook w:firstColumn="1" w:firstRow="1" w:lastColumn="0" w:lastRow="0" w:noHBand="0" w:noVBand="1" w:val="04A0"/>
+      </w:tblPr>
+      <w:tblGrid>
+        <w:gridCol w:w="2880"/>
+        <w:gridCol w:w="2880"/>
+        <w:gridCol w:w="2880"/>
+      </w:tblGrid>
+      <w:tr>
+        <w:tc>
+          <w:tcPr>
+            <w:tcW w:type="dxa" w:w="2880"/>
+            <w:shd w:val="clear" w:color="auto" w:fill="1F6FEB"/>
+          </w:tcPr>
+          <w:p>
+            <w:r/>
+            <w:r>
+              <w:rPr>
+                <w:b/>
+                <w:color w:val="FFFFFF"/>
+                <w:sz w:val="19"/>
+              </w:rPr>
+              <w:t>Principle</w:t>
+            </w:r>
+          </w:p>
+        </w:tc>
+        <w:tc>
+          <w:tcPr>
+            <w:tcW w:type="dxa" w:w="2880"/>
+            <w:shd w:val="clear" w:color="auto" w:fill="1F6FEB"/>
+          </w:tcPr>
+          <w:p>
+            <w:r/>
+            <w:r>
+              <w:rPr>
+                <w:b/>
+                <w:color w:val="FFFFFF"/>
+                <w:sz w:val="19"/>
+              </w:rPr>
+              <w:t>Workflow First</w:t>
+            </w:r>
+          </w:p>
+        </w:tc>
+        <w:tc>
+          <w:tcPr>
+            <w:tcW w:type="dxa" w:w="2880"/>
+            <w:shd w:val="clear" w:color="auto" w:fill="1F6FEB"/>
+          </w:tcPr>
+          <w:p>
+            <w:r/>
+            <w:r>
+              <w:rPr>
+                <w:b/>
+                <w:color w:val="FFFFFF"/>
+                <w:sz w:val="19"/>
+              </w:rPr>
+              <w:t>AI First (AI Agent)</w:t>
+            </w:r>
+          </w:p>
+        </w:tc>
+      </w:tr>
+      <w:tr>
+        <w:tc>
+          <w:tcPr>
+            <w:tcW w:type="dxa" w:w="2880"/>
+          </w:tcPr>
+          <w:p>
+            <w:r/>
+            <w:r>
+              <w:rPr>
+                <w:b/>
+                <w:sz w:val="19"/>
+              </w:rPr>
+              <w:t>Data control</w:t>
+            </w:r>
+          </w:p>
+        </w:tc>
+        <w:tc>
+          <w:tcPr>
+            <w:tcW w:type="dxa" w:w="2880"/>
+          </w:tcPr>
+          <w:p>
+            <w:r/>
+            <w:r>
+              <w:rPr>
+                <w:sz w:val="19"/>
+              </w:rPr>
+              <w:t>Each node sees only the fields wired into it</w:t>
+            </w:r>
+          </w:p>
+        </w:tc>
+        <w:tc>
+          <w:tcPr>
+            <w:tcW w:type="dxa" w:w="2880"/>
+          </w:tcPr>
+          <w:p>
+            <w:r/>
+            <w:r>
+              <w:rPr>
+                <w:sz w:val="19"/>
+              </w:rPr>
+              <w:t>The agent can reach any data its tools expose</w:t>
+            </w:r>
+          </w:p>
+        </w:tc>
+      </w:tr>
+      <w:tr>
+        <w:tc>
+          <w:tcPr>
+            <w:tcW w:type="dxa" w:w="2880"/>
+          </w:tcPr>
+          <w:p>
+            <w:r/>
+            <w:r>
+              <w:rPr>
+                <w:b/>
+                <w:sz w:val="19"/>
+              </w:rPr>
+              <w:t>Permission control</w:t>
+            </w:r>
+          </w:p>
+        </w:tc>
+        <w:tc>
+          <w:tcPr>
+            <w:tcW w:type="dxa" w:w="2880"/>
+          </w:tcPr>
+          <w:p>
+            <w:r/>
+            <w:r>
+              <w:rPr>
+                <w:sz w:val="19"/>
+              </w:rPr>
+              <w:t>Each credential is scoped to one node and one action</w:t>
+            </w:r>
+          </w:p>
+        </w:tc>
+        <w:tc>
+          <w:tcPr>
+            <w:tcW w:type="dxa" w:w="2880"/>
+          </w:tcPr>
+          <w:p>
+            <w:r/>
+            <w:r>
+              <w:rPr>
+                <w:sz w:val="19"/>
+              </w:rPr>
+              <w:t>The agent holds every tool's rights at once</w:t>
+            </w:r>
+          </w:p>
+        </w:tc>
+      </w:tr>
+      <w:tr>
+        <w:tc>
+          <w:tcPr>
+            <w:tcW w:type="dxa" w:w="2880"/>
+          </w:tcPr>
+          <w:p>
+            <w:r/>
+            <w:r>
+              <w:rPr>
+                <w:b/>
+                <w:sz w:val="19"/>
+              </w:rPr>
+              <w:t>Human in the loop</w:t>
+            </w:r>
+          </w:p>
+        </w:tc>
+        <w:tc>
+          <w:tcPr>
+            <w:tcW w:type="dxa" w:w="2880"/>
+          </w:tcPr>
+          <w:p>
+            <w:r/>
+            <w:r>
+              <w:rPr>
+                <w:sz w:val="19"/>
+              </w:rPr>
+              <w:t>The approval gate sits at a fixed, designed step</w:t>
+            </w:r>
+          </w:p>
+        </w:tc>
+        <w:tc>
+          <w:tcPr>
+            <w:tcW w:type="dxa" w:w="2880"/>
+          </w:tcPr>
+          <w:p>
+            <w:r/>
+            <w:r>
+              <w:rPr>
+                <w:sz w:val="19"/>
+              </w:rPr>
+              <w:t>Depends on the agent choosing to ask</w:t>
+            </w:r>
+          </w:p>
+        </w:tc>
+      </w:tr>
+      <w:tr>
+        <w:tc>
+          <w:tcPr>
+            <w:tcW w:type="dxa" w:w="2880"/>
+          </w:tcPr>
+          <w:p>
+            <w:r/>
+            <w:r>
+              <w:rPr>
+                <w:b/>
+                <w:sz w:val="19"/>
+              </w:rPr>
+              <w:t>Traceability</w:t>
+            </w:r>
+          </w:p>
+        </w:tc>
+        <w:tc>
+          <w:tcPr>
+            <w:tcW w:type="dxa" w:w="2880"/>
+          </w:tcPr>
+          <w:p>
+            <w:r/>
+            <w:r>
+              <w:rPr>
+                <w:sz w:val="19"/>
+              </w:rPr>
+              <w:t>Every run is logged node by node in Executions</w:t>
+            </w:r>
+          </w:p>
+        </w:tc>
+        <w:tc>
+          <w:tcPr>
+            <w:tcW w:type="dxa" w:w="2880"/>
+          </w:tcPr>
+          <w:p>
+            <w:r/>
+            <w:r>
+              <w:rPr>
+                <w:sz w:val="19"/>
+              </w:rPr>
+              <w:t>Reasoning varies run to run and is harder to explain</w:t>
+            </w:r>
+          </w:p>
+        </w:tc>
+      </w:tr>
+      <w:tr>
+        <w:tc>
+          <w:tcPr>
+            <w:tcW w:type="dxa" w:w="2880"/>
+          </w:tcPr>
+          <w:p>
+            <w:r/>
+            <w:r>
+              <w:rPr>
+                <w:b/>
+                <w:sz w:val="19"/>
+              </w:rPr>
+              <w:t>Right-sized models</w:t>
+            </w:r>
+          </w:p>
+        </w:tc>
+        <w:tc>
+          <w:tcPr>
+            <w:tcW w:type="dxa" w:w="2880"/>
+          </w:tcPr>
+          <w:p>
+            <w:r/>
+            <w:r>
+              <w:rPr>
+                <w:sz w:val="19"/>
+              </w:rPr>
+              <w:t>A small model for each narrow AI step</w:t>
+            </w:r>
+          </w:p>
+        </w:tc>
+        <w:tc>
+          <w:tcPr>
+            <w:tcW w:type="dxa" w:w="2880"/>
+          </w:tcPr>
+          <w:p>
+            <w:r/>
+            <w:r>
+              <w:rPr>
+                <w:sz w:val="19"/>
+              </w:rPr>
+              <w:t>One capable model with broad autonomy</w:t>
+            </w:r>
+          </w:p>
+        </w:tc>
+      </w:tr>
+    </w:tbl>
+    <w:p/>
+    <w:p>
+      <w:r>
+        <w:rPr>
+          <w:b/>
+          <w:color w:val="1F6FEB"/>
+          <w:sz w:val="22"/>
+        </w:rPr>
+        <w:t>Business value of workflow-first agentic automation</w:t>
       </w:r>
     </w:p>
     <w:p>
@@ -2442,7 +3695,7 @@
         <w:pStyle w:val="ListBullet"/>
       </w:pPr>
       <w:r>
-        <w:t>Free people from repetitive administrative work — scheduling, form processing, data entry, report generation and email routing.</w:t>
+        <w:t>Reliable and predictable — the same input follows the same path every time, so the process can be tested and trusted like software.</w:t>
       </w:r>
     </w:p>
     <w:p>
@@ -2450,7 +3703,7 @@
         <w:pStyle w:val="ListBullet"/>
       </w:pPr>
       <w:r>
-        <w:t>Shift human effort to judgement, relationships and strategy.</w:t>
+        <w:t>Secure by design — each step holds only the data and credentials it needs, and risky actions wait at an approval gate.</w:t>
       </w:r>
     </w:p>
     <w:p>
@@ -2458,7 +3711,7 @@
         <w:pStyle w:val="ListBullet"/>
       </w:pPr>
       <w:r>
-        <w:t>React to events in real time — a form submission, a payment, a customer message.</w:t>
+        <w:t>Auditable end to end — every run is logged node by node, so any decision can be explained, replayed and corrected.</w:t>
       </w:r>
     </w:p>
     <w:p>
@@ -2466,7 +3719,7 @@
         <w:pStyle w:val="ListBullet"/>
       </w:pPr>
       <w:r>
-        <w:t>Operate around the clock, with the same care at 2am as at 2pm.</w:t>
+        <w:t>Lower running cost — deterministic steps cost nothing in tokens; the LLM is called only where judgement is needed.</w:t>
       </w:r>
     </w:p>
     <w:p>
@@ -2474,7 +3727,7 @@
         <w:pStyle w:val="ListBullet"/>
       </w:pPr>
       <w:r>
-        <w:t>Reduce human error by applying the same rules to every case and logging every decision.</w:t>
+        <w:t>Faster to build and change — Claude Code and Codex draft the workflow in minutes; your team reviews, tests and owns it.</w:t>
       </w:r>
     </w:p>
     <w:p>
@@ -2482,7 +3735,22 @@
         <w:pStyle w:val="ListBullet"/>
       </w:pPr>
       <w:r>
-        <w:t>Scale volume without proportional headcount.</w:t>
+        <w:t>Scale around the clock — triggers respond in real time, 24/7, and ten times the volume costs compute, not ten more hires.</w:t>
+      </w:r>
+    </w:p>
+    <w:p>
+      <w:r>
+        <w:rPr>
+          <w:b/>
+          <w:color w:val="1F6FEB"/>
+          <w:sz w:val="22"/>
+        </w:rPr>
+        <w:t>Where agentic automation is used</w:t>
+      </w:r>
+    </w:p>
+    <w:p>
+      <w:r>
+        <w:t>The same pattern — trigger, agent, tools, oversight — recurs in customer service, finance and accounting, risk and compliance, HR and people operations, sales and marketing, and operations.</w:t>
       </w:r>
     </w:p>
     <w:p>
@@ -2696,20 +3964,6 @@
       </w:tr>
     </w:tbl>
     <w:p/>
-    <w:p/>
-    <w:p>
-      <w:pPr>
-        <w:pStyle w:val="Heading1"/>
-      </w:pPr>
-      <w:r>
-        <w:t>Topic 01 — Overview of n8n and AI Agents</w:t>
-      </w:r>
-    </w:p>
-    <w:p>
-      <w:r>
-        <w:t>Workflow automation · Triggers &amp; actions · LLM agents · Webhooks   (Deck reference: Slides 27–65.)</w:t>
-      </w:r>
-    </w:p>
     <w:p>
       <w:r>
         <w:rPr>
@@ -3029,7 +4283,7 @@
     </w:p>
     <w:p>
       <w:r>
-        <w:t>Deck reference: Slides 58–61.</w:t>
+        <w:t>Deck reference: Slides 61–64.</w:t>
       </w:r>
     </w:p>
     <w:p>
@@ -3070,7 +4324,7 @@
         <w:drawing>
           <wp:inline xmlns:a="http://schemas.openxmlformats.org/drawingml/2006/main" xmlns:pic="http://schemas.openxmlformats.org/drawingml/2006/picture">
             <wp:extent cx="5669280" cy="2381098"/>
-            <wp:docPr id="5" name="Picture 5"/>
+            <wp:docPr id="4" name="Picture 4"/>
             <wp:cNvGraphicFramePr>
               <a:graphicFrameLocks noChangeAspect="1"/>
             </wp:cNvGraphicFramePr>
@@ -3082,7 +4336,7 @@
                     <pic:cNvPicPr/>
                   </pic:nvPicPr>
                   <pic:blipFill>
-                    <a:blip r:embed="rId13"/>
+                    <a:blip r:embed="rId12"/>
                     <a:stretch>
                       <a:fillRect/>
                     </a:stretch>
@@ -3122,7 +4376,7 @@
         <w:drawing>
           <wp:inline xmlns:a="http://schemas.openxmlformats.org/drawingml/2006/main" xmlns:pic="http://schemas.openxmlformats.org/drawingml/2006/picture">
             <wp:extent cx="5669280" cy="3188970"/>
-            <wp:docPr id="6" name="Picture 6"/>
+            <wp:docPr id="5" name="Picture 5"/>
             <wp:cNvGraphicFramePr>
               <a:graphicFrameLocks noChangeAspect="1"/>
             </wp:cNvGraphicFramePr>
@@ -3134,7 +4388,7 @@
                     <pic:cNvPicPr/>
                   </pic:nvPicPr>
                   <pic:blipFill>
-                    <a:blip r:embed="rId14"/>
+                    <a:blip r:embed="rId13"/>
                     <a:stretch>
                       <a:fillRect/>
                     </a:stretch>
@@ -3184,7 +4438,7 @@
         <w:drawing>
           <wp:inline xmlns:a="http://schemas.openxmlformats.org/drawingml/2006/main" xmlns:pic="http://schemas.openxmlformats.org/drawingml/2006/picture">
             <wp:extent cx="5669280" cy="2598791"/>
-            <wp:docPr id="7" name="Picture 7"/>
+            <wp:docPr id="6" name="Picture 6"/>
             <wp:cNvGraphicFramePr>
               <a:graphicFrameLocks noChangeAspect="1"/>
             </wp:cNvGraphicFramePr>
@@ -3196,7 +4450,7 @@
                     <pic:cNvPicPr/>
                   </pic:nvPicPr>
                   <pic:blipFill>
-                    <a:blip r:embed="rId15"/>
+                    <a:blip r:embed="rId14"/>
                     <a:stretch>
                       <a:fillRect/>
                     </a:stretch>
@@ -3830,7 +5084,7 @@
     </w:p>
     <w:p>
       <w:r>
-        <w:t>Deck reference: Slides 62–64.</w:t>
+        <w:t>Deck reference: Slides 65–67.</w:t>
       </w:r>
     </w:p>
     <w:p>
@@ -3871,7 +5125,7 @@
         <w:drawing>
           <wp:inline xmlns:a="http://schemas.openxmlformats.org/drawingml/2006/main" xmlns:pic="http://schemas.openxmlformats.org/drawingml/2006/picture">
             <wp:extent cx="5669280" cy="2480310"/>
-            <wp:docPr id="8" name="Picture 8"/>
+            <wp:docPr id="7" name="Picture 7"/>
             <wp:cNvGraphicFramePr>
               <a:graphicFrameLocks noChangeAspect="1"/>
             </wp:cNvGraphicFramePr>
@@ -3883,7 +5137,7 @@
                     <pic:cNvPicPr/>
                   </pic:nvPicPr>
                   <pic:blipFill>
-                    <a:blip r:embed="rId16"/>
+                    <a:blip r:embed="rId15"/>
                     <a:stretch>
                       <a:fillRect/>
                     </a:stretch>
@@ -3933,7 +5187,7 @@
         <w:drawing>
           <wp:inline xmlns:a="http://schemas.openxmlformats.org/drawingml/2006/main" xmlns:pic="http://schemas.openxmlformats.org/drawingml/2006/picture">
             <wp:extent cx="5669280" cy="1738361"/>
-            <wp:docPr id="9" name="Picture 9"/>
+            <wp:docPr id="8" name="Picture 8"/>
             <wp:cNvGraphicFramePr>
               <a:graphicFrameLocks noChangeAspect="1"/>
             </wp:cNvGraphicFramePr>
@@ -3945,7 +5199,7 @@
                     <pic:cNvPicPr/>
                   </pic:nvPicPr>
                   <pic:blipFill>
-                    <a:blip r:embed="rId17"/>
+                    <a:blip r:embed="rId16"/>
                     <a:stretch>
                       <a:fillRect/>
                     </a:stretch>
@@ -4674,7 +5928,7 @@
     </w:p>
     <w:p>
       <w:r>
-        <w:t>Agentic workflows · Chatbots on webhooks · Approval gates · Accountability   (Deck reference: Slides 66–77.)</w:t>
+        <w:t>Agentic workflows · Chatbots on webhooks · Approval gates · Accountability   (Deck reference: Slides 69–80.)</w:t>
       </w:r>
     </w:p>
     <w:p>
@@ -4842,7 +6096,7 @@
     </w:p>
     <w:p>
       <w:r>
-        <w:t>Deck reference: Slides 71–73.</w:t>
+        <w:t>Deck reference: Slides 74–76.</w:t>
       </w:r>
     </w:p>
     <w:p>
@@ -4883,7 +6137,7 @@
         <w:drawing>
           <wp:inline xmlns:a="http://schemas.openxmlformats.org/drawingml/2006/main" xmlns:pic="http://schemas.openxmlformats.org/drawingml/2006/picture">
             <wp:extent cx="5669280" cy="3543300"/>
-            <wp:docPr id="10" name="Picture 10"/>
+            <wp:docPr id="9" name="Picture 9"/>
             <wp:cNvGraphicFramePr>
               <a:graphicFrameLocks noChangeAspect="1"/>
             </wp:cNvGraphicFramePr>
@@ -4895,7 +6149,7 @@
                     <pic:cNvPicPr/>
                   </pic:nvPicPr>
                   <pic:blipFill>
-                    <a:blip r:embed="rId18"/>
+                    <a:blip r:embed="rId17"/>
                     <a:stretch>
                       <a:fillRect/>
                     </a:stretch>
@@ -4945,7 +6199,7 @@
         <w:drawing>
           <wp:inline xmlns:a="http://schemas.openxmlformats.org/drawingml/2006/main" xmlns:pic="http://schemas.openxmlformats.org/drawingml/2006/picture">
             <wp:extent cx="5669280" cy="1984818"/>
-            <wp:docPr id="11" name="Picture 11"/>
+            <wp:docPr id="10" name="Picture 10"/>
             <wp:cNvGraphicFramePr>
               <a:graphicFrameLocks noChangeAspect="1"/>
             </wp:cNvGraphicFramePr>
@@ -4957,7 +6211,7 @@
                     <pic:cNvPicPr/>
                   </pic:nvPicPr>
                   <pic:blipFill>
-                    <a:blip r:embed="rId19"/>
+                    <a:blip r:embed="rId18"/>
                     <a:stretch>
                       <a:fillRect/>
                     </a:stretch>
@@ -5640,7 +6894,7 @@
     </w:p>
     <w:p>
       <w:r>
-        <w:t>Deck reference: Slides 74–76.</w:t>
+        <w:t>Deck reference: Slides 77–79.</w:t>
       </w:r>
     </w:p>
     <w:p>
@@ -5681,7 +6935,7 @@
         <w:drawing>
           <wp:inline xmlns:a="http://schemas.openxmlformats.org/drawingml/2006/main" xmlns:pic="http://schemas.openxmlformats.org/drawingml/2006/picture">
             <wp:extent cx="5669280" cy="3271647"/>
-            <wp:docPr id="12" name="Picture 12"/>
+            <wp:docPr id="11" name="Picture 11"/>
             <wp:cNvGraphicFramePr>
               <a:graphicFrameLocks noChangeAspect="1"/>
             </wp:cNvGraphicFramePr>
@@ -5693,7 +6947,7 @@
                     <pic:cNvPicPr/>
                   </pic:nvPicPr>
                   <pic:blipFill>
-                    <a:blip r:embed="rId20"/>
+                    <a:blip r:embed="rId19"/>
                     <a:stretch>
                       <a:fillRect/>
                     </a:stretch>
@@ -5743,7 +6997,7 @@
         <w:drawing>
           <wp:inline xmlns:a="http://schemas.openxmlformats.org/drawingml/2006/main" xmlns:pic="http://schemas.openxmlformats.org/drawingml/2006/picture">
             <wp:extent cx="5669280" cy="1751834"/>
-            <wp:docPr id="13" name="Picture 13"/>
+            <wp:docPr id="12" name="Picture 12"/>
             <wp:cNvGraphicFramePr>
               <a:graphicFrameLocks noChangeAspect="1"/>
             </wp:cNvGraphicFramePr>
@@ -5755,7 +7009,7 @@
                     <pic:cNvPicPr/>
                   </pic:nvPicPr>
                   <pic:blipFill>
-                    <a:blip r:embed="rId21"/>
+                    <a:blip r:embed="rId20"/>
                     <a:stretch>
                       <a:fillRect/>
                     </a:stretch>
@@ -6554,7 +7808,7 @@
     </w:p>
     <w:p>
       <w:r>
-        <w:t>Tokenization · Embeddings · Vector stores · Grounded answers   (Deck reference: Slides 78–90.)</w:t>
+        <w:t>Tokenization · Embeddings · Vector stores · Grounded answers   (Deck reference: Slides 81–93.)</w:t>
       </w:r>
     </w:p>
     <w:p>
@@ -6673,7 +7927,7 @@
         <w:drawing>
           <wp:inline xmlns:a="http://schemas.openxmlformats.org/drawingml/2006/main" xmlns:pic="http://schemas.openxmlformats.org/drawingml/2006/picture">
             <wp:extent cx="5669280" cy="2914918"/>
-            <wp:docPr id="14" name="Picture 14"/>
+            <wp:docPr id="13" name="Picture 13"/>
             <wp:cNvGraphicFramePr>
               <a:graphicFrameLocks noChangeAspect="1"/>
             </wp:cNvGraphicFramePr>
@@ -6685,7 +7939,7 @@
                     <pic:cNvPicPr/>
                   </pic:nvPicPr>
                   <pic:blipFill>
-                    <a:blip r:embed="rId22"/>
+                    <a:blip r:embed="rId21"/>
                     <a:stretch>
                       <a:fillRect/>
                     </a:stretch>
@@ -6725,7 +7979,7 @@
         <w:drawing>
           <wp:inline xmlns:a="http://schemas.openxmlformats.org/drawingml/2006/main" xmlns:pic="http://schemas.openxmlformats.org/drawingml/2006/picture">
             <wp:extent cx="5669280" cy="1774418"/>
-            <wp:docPr id="15" name="Picture 15"/>
+            <wp:docPr id="14" name="Picture 14"/>
             <wp:cNvGraphicFramePr>
               <a:graphicFrameLocks noChangeAspect="1"/>
             </wp:cNvGraphicFramePr>
@@ -6737,7 +7991,7 @@
                     <pic:cNvPicPr/>
                   </pic:nvPicPr>
                   <pic:blipFill>
-                    <a:blip r:embed="rId23"/>
+                    <a:blip r:embed="rId22"/>
                     <a:stretch>
                       <a:fillRect/>
                     </a:stretch>
@@ -6777,7 +8031,7 @@
         <w:drawing>
           <wp:inline xmlns:a="http://schemas.openxmlformats.org/drawingml/2006/main" xmlns:pic="http://schemas.openxmlformats.org/drawingml/2006/picture">
             <wp:extent cx="5669280" cy="3188970"/>
-            <wp:docPr id="16" name="Picture 16"/>
+            <wp:docPr id="15" name="Picture 15"/>
             <wp:cNvGraphicFramePr>
               <a:graphicFrameLocks noChangeAspect="1"/>
             </wp:cNvGraphicFramePr>
@@ -6789,7 +8043,7 @@
                     <pic:cNvPicPr/>
                   </pic:nvPicPr>
                   <pic:blipFill>
-                    <a:blip r:embed="rId24"/>
+                    <a:blip r:embed="rId23"/>
                     <a:stretch>
                       <a:fillRect/>
                     </a:stretch>
@@ -6836,7 +8090,7 @@
     </w:p>
     <w:p>
       <w:r>
-        <w:t>Deck reference: Slides 87–90.</w:t>
+        <w:t>Deck reference: Slides 90–93.</w:t>
       </w:r>
     </w:p>
     <w:p>
@@ -6877,7 +8131,7 @@
         <w:drawing>
           <wp:inline xmlns:a="http://schemas.openxmlformats.org/drawingml/2006/main" xmlns:pic="http://schemas.openxmlformats.org/drawingml/2006/picture">
             <wp:extent cx="5669280" cy="3543300"/>
-            <wp:docPr id="17" name="Picture 17"/>
+            <wp:docPr id="16" name="Picture 16"/>
             <wp:cNvGraphicFramePr>
               <a:graphicFrameLocks noChangeAspect="1"/>
             </wp:cNvGraphicFramePr>
@@ -6889,7 +8143,7 @@
                     <pic:cNvPicPr/>
                   </pic:nvPicPr>
                   <pic:blipFill>
-                    <a:blip r:embed="rId25"/>
+                    <a:blip r:embed="rId24"/>
                     <a:stretch>
                       <a:fillRect/>
                     </a:stretch>
@@ -6939,7 +8193,7 @@
         <w:drawing>
           <wp:inline xmlns:a="http://schemas.openxmlformats.org/drawingml/2006/main" xmlns:pic="http://schemas.openxmlformats.org/drawingml/2006/picture">
             <wp:extent cx="5669280" cy="1978033"/>
-            <wp:docPr id="18" name="Picture 18"/>
+            <wp:docPr id="17" name="Picture 17"/>
             <wp:cNvGraphicFramePr>
               <a:graphicFrameLocks noChangeAspect="1"/>
             </wp:cNvGraphicFramePr>
@@ -6951,7 +8205,7 @@
                     <pic:cNvPicPr/>
                   </pic:nvPicPr>
                   <pic:blipFill>
-                    <a:blip r:embed="rId26"/>
+                    <a:blip r:embed="rId25"/>
                     <a:stretch>
                       <a:fillRect/>
                     </a:stretch>
@@ -6991,7 +8245,7 @@
         <w:drawing>
           <wp:inline xmlns:a="http://schemas.openxmlformats.org/drawingml/2006/main" xmlns:pic="http://schemas.openxmlformats.org/drawingml/2006/picture">
             <wp:extent cx="5669280" cy="2134729"/>
-            <wp:docPr id="19" name="Picture 19"/>
+            <wp:docPr id="18" name="Picture 18"/>
             <wp:cNvGraphicFramePr>
               <a:graphicFrameLocks noChangeAspect="1"/>
             </wp:cNvGraphicFramePr>
@@ -7003,7 +8257,7 @@
                     <pic:cNvPicPr/>
                   </pic:nvPicPr>
                   <pic:blipFill>
-                    <a:blip r:embed="rId27"/>
+                    <a:blip r:embed="rId26"/>
                     <a:stretch>
                       <a:fillRect/>
                     </a:stretch>
@@ -8225,7 +9479,7 @@
       </w:r>
     </w:p>
     <w:sectPr>
-      <w:footerReference w:type="default" r:id="rId28"/>
+      <w:footerReference w:type="default" r:id="rId27"/>
       <w:pgSz w:w="12240" w:h="15840"/>
       <w:pgMar w:top="1440" w:right="1800" w:bottom="1440" w:left="1800" w:header="720" w:footer="720" w:gutter="0"/>
       <w:cols w:space="720"/>

</xml_diff>

<commit_message>
feat(courseware): Agent First wording; AI agents as always-on agentic AI
Rename 'AI First' to 'Agent First', and make clear a workflow-first
process can still contain AI and AI Agent nodes, as in n8n. Recast
Agentic AI vs AI Agents: AI agents are a special, always-on type of
agentic AI system, usually cloud-hosted and serving 24/7.

Co-Authored-By: Claude Opus 5.5 <noreply@anthropic.com>
</commit_message>
<xml_diff>
--- a/courseware/LG-Agentic AI for Business Process Automation.docx
+++ b/courseware/LG-Agentic AI for Business Process Automation.docx
@@ -593,7 +593,7 @@
               <w:rPr>
                 <w:sz w:val="19"/>
               </w:rPr>
-              <w:t>Topic 1 now opens with the modern view of agentic automation, replacing the separate Foundation section: a brief history of AI 2023–2026 (prompt, context and harness engineering to AI agents), agentic AI vs AI agents, workflow first vs AI first, the trend of using Claude Code and Codex to build workflows, the five principles of AI security and why workflow first is more secure, and the business value of workflow-first agentic automation.</w:t>
+              <w:t>Topic 1 now opens with the modern view of agentic automation, replacing the separate Foundation section: a brief history of AI 2023–2026 (prompt, context and harness engineering to AI agents), agentic AI vs AI agents, workflow first vs agent first, the trend of using Claude Code and Codex to build workflows, the five principles of AI security and why workflow first is more secure, and the business value of workflow-first agentic automation.</w:t>
             </w:r>
           </w:p>
         </w:tc>
@@ -2695,7 +2695,7 @@
     </w:p>
     <w:p>
       <w:r>
-        <w:t>The two terms are often used loosely; in this course they mean different things. AGENTIC AI is the umbrella term for the whole system — any system in which AI pursues a goal over many steps, planning, acting through tools, checking the result and adapting. It includes the orchestration, the data, the guardrails and the human approvals, and it can be built as a workflow with AI steps or around one or more agents. An AI AGENT is one building block inside it: a single LLM given a goal, tools, memory and instructions, which decides its own next step in a loop and chooses which tool to call and when. In n8n that is the AI Agent node with its Chat Model, Memory and Tools. The best agentic systems use agents only where judgement is needed.</w:t>
+        <w:t>AGENTIC AI is the broad category: any AI system that pursues a goal over many steps — it plans, acts through tools, checks the result and adapts. It is usually started by a person or a trigger and stops when the task is done; a Claude Code or Codex session, or an n8n workflow with AI steps, are agentic AI. AI AGENTS are a special type of agentic AI system that exists 24/7. They are usually installed in the cloud so they serve all the time, with no laptop needing to be open: they wait for events — messages, emails, webhooks, schedules — act on them around the clock, and keep their memory across conversations and days. OpenClaw, Hermes Agent and an n8n agent running on a cloud instance behind a webhook are AI agents. Every AI agent is agentic AI, but not every agentic AI is an AI agent — the difference is that an AI agent is always on.</w:t>
       </w:r>
     </w:p>
     <w:p>
@@ -2705,12 +2705,12 @@
           <w:color w:val="1F6FEB"/>
           <w:sz w:val="22"/>
         </w:rPr>
-        <w:t>Workflow first vs AI first</w:t>
-      </w:r>
-    </w:p>
-    <w:p>
-      <w:r>
-        <w:t>There are two ways to build agentic automation. WORKFLOW FIRST is the modern form of rule-based (RPA-style) automation: you design the path, and AI is added only at the steps that need judgement. AI FIRST hands the path to an AI agent, which decides the steps and tools at run time.</w:t>
+        <w:t>Workflow first vs agent first</w:t>
+      </w:r>
+    </w:p>
+    <w:p>
+      <w:r>
+        <w:t>There are two ways to build agentic automation. WORKFLOW FIRST is the modern form of rule-based (RPA-style) automation: the workflow owns the path, and its steps can be ordinary nodes, AI nodes or even AI Agent nodes — exactly as in n8n, where an AI Agent node sits inside a workflow. AGENT FIRST hands the whole path to an AI agent, which decides the steps and tools at run time.</w:t>
       </w:r>
     </w:p>
     <w:tbl>
@@ -2771,7 +2771,7 @@
                 <w:color w:val="FFFFFF"/>
                 <w:sz w:val="19"/>
               </w:rPr>
-              <w:t>AI First (AI Agent)</w:t>
+              <w:t>Agent First</w:t>
             </w:r>
           </w:p>
         </w:tc>
@@ -2802,7 +2802,7 @@
               <w:rPr>
                 <w:sz w:val="19"/>
               </w:rPr>
-              <w:t>You design the steps; AI handles individual nodes</w:t>
+              <w:t>The workflow — steps may be AI nodes or AI Agent nodes</w:t>
             </w:r>
           </w:p>
         </w:tc>
@@ -3050,7 +3050,7 @@
     <w:p/>
     <w:p>
       <w:r>
-        <w:t>Workflow first is more deterministic; AI first is more efficient. Because reliability matters most in business, companies try to make as much of a process deterministic as possible. (Source: n8n, In The Loop 2026 opening keynote and product direction.)</w:t>
+        <w:t>Workflow first is more deterministic; agent first is more efficient. Because reliability matters most in business, companies try to make as much of a process deterministic as possible. (Source: n8n, In The Loop 2026 opening keynote and product direction.)</w:t>
       </w:r>
     </w:p>
     <w:p>
@@ -3448,7 +3448,7 @@
                 <w:color w:val="FFFFFF"/>
                 <w:sz w:val="19"/>
               </w:rPr>
-              <w:t>AI First (AI Agent)</w:t>
+              <w:t>Agent First</w:t>
             </w:r>
           </w:p>
         </w:tc>

</xml_diff>

<commit_message>
feat(courseware): AI-assisted workflow creation, free AI credits, social campaign demo
Topic 1's trend slide becomes AI-Assisted Workflow Creation, followed by
an n8n Assistant screenshot, the steps to use the free Gateway AI credits
(and why the legacy free-OpenAI-credits toast appears), and a demo prompt
that builds a social media campaign workflow: research, draft, human
approval, schedule. Mirrored in the Learner Guide; LP references updated.
Also corrects the Lab 3 AI Agent chevron (Gemini 2.5 Flash, temp 0.2).

Co-Authored-By: Claude Opus 5.5 <noreply@anthropic.com>
</commit_message>
<xml_diff>
--- a/courseware/LG-Agentic AI for Business Process Automation.docx
+++ b/courseware/LG-Agentic AI for Business Process Automation.docx
@@ -593,7 +593,7 @@
               <w:rPr>
                 <w:sz w:val="19"/>
               </w:rPr>
-              <w:t>Topic 1 now opens with the modern view of agentic automation, replacing the separate Foundation section: a brief history of AI 2023–2026 (prompt, context and harness engineering to AI agents), agentic AI vs AI agents, workflow first vs agent first, the trend of using Claude Code and Codex to build workflows, the five principles of AI security and why workflow first is more secure, and the business value of workflow-first agentic automation.</w:t>
+              <w:t>Topic 1 now opens with the modern view of agentic automation, replacing the separate Foundation section: a brief history of AI 2023–2026 (prompt, context and harness engineering to AI agents), agentic AI vs AI agents, workflow first vs agent first, AI-assisted workflow creation with n8n Assistant (plus claiming the free AI credits and a social media campaign demo), an n8n training-accounts slide, the five principles of AI security and why workflow first is more secure, and the business value of workflow-first agentic automation.</w:t>
             </w:r>
           </w:p>
         </w:tc>
@@ -764,7 +764,7 @@
         </w:rPr>
         <w:t>Lab 1 — n8n Trigger and Action (Event Flyer with QR Code)</w:t>
         <w:tab/>
-        <w:t>14</w:t>
+        <w:t>16</w:t>
       </w:r>
     </w:p>
     <w:p>
@@ -784,7 +784,7 @@
         </w:rPr>
         <w:t>Lab 2 — Webhook and AI Agent (Marina Trust Bank Onboarding)</w:t>
         <w:tab/>
-        <w:t>18</w:t>
+        <w:t>20</w:t>
       </w:r>
     </w:p>
     <w:p>
@@ -803,7 +803,7 @@
         </w:rPr>
         <w:t>Topic 02 — Agentic Chatbot and Human in the Loop</w:t>
         <w:tab/>
-        <w:t>21</w:t>
+        <w:t>23</w:t>
       </w:r>
     </w:p>
     <w:p>
@@ -823,7 +823,7 @@
         </w:rPr>
         <w:t>Lab 3 — Chatbot Webhook (Investment Advisor)</w:t>
         <w:tab/>
-        <w:t>23</w:t>
+        <w:t>25</w:t>
       </w:r>
     </w:p>
     <w:p>
@@ -843,7 +843,7 @@
         </w:rPr>
         <w:t>Lab 4 — Human in the Loop (Client Rapport Assistant)</w:t>
         <w:tab/>
-        <w:t>26</w:t>
+        <w:t>28</w:t>
       </w:r>
     </w:p>
     <w:p>
@@ -862,7 +862,7 @@
         </w:rPr>
         <w:t>Topic 03 — Retrieval-Augmented Generation (RAG)</w:t>
         <w:tab/>
-        <w:t>30</w:t>
+        <w:t>32</w:t>
       </w:r>
     </w:p>
     <w:p>
@@ -882,7 +882,7 @@
         </w:rPr>
         <w:t>Lab 5 — RAG Customer Care Chatbot (Cook &amp; Bake Academy)</w:t>
         <w:tab/>
-        <w:t>32</w:t>
+        <w:t>34</w:t>
       </w:r>
     </w:p>
     <w:p>
@@ -901,7 +901,7 @@
         </w:rPr>
         <w:t>Taking This Back to Work</w:t>
         <w:tab/>
-        <w:t>37</w:t>
+        <w:t>39</w:t>
       </w:r>
     </w:p>
     <w:p>
@@ -920,7 +920,7 @@
         </w:rPr>
         <w:t>Assessment</w:t>
         <w:tab/>
-        <w:t>37</w:t>
+        <w:t>39</w:t>
       </w:r>
     </w:p>
     <w:p>
@@ -939,7 +939,7 @@
         </w:rPr>
         <w:t>Glossary</w:t>
         <w:tab/>
-        <w:t>37</w:t>
+        <w:t>39</w:t>
       </w:r>
     </w:p>
     <w:p>
@@ -1531,6 +1531,14 @@
         <w:pStyle w:val="ListBullet"/>
       </w:pPr>
       <w:r>
+        <w:t>Your n8n training account — the trainer assigns one per learner (see the n8n Training Accounts slide). Sign in with it, and do not change its password.</w:t>
+      </w:r>
+    </w:p>
+    <w:p>
+      <w:pPr>
+        <w:pStyle w:val="ListBullet"/>
+      </w:pPr>
+      <w:r>
         <w:t>A modern web browser — several labs open a local HTML page that talks to your n8n webhook.</w:t>
       </w:r>
     </w:p>
@@ -2039,7 +2047,7 @@
     </w:p>
     <w:p>
       <w:r>
-        <w:t>Why agentic AI · Workflow first · Triggers &amp; actions · LLM agents · Webhooks   (Deck reference: Slides 21–68.)</w:t>
+        <w:t>Why agentic AI · Workflow first · Triggers &amp; actions · LLM agents · Webhooks   (Deck reference: Slides 21–71.)</w:t>
       </w:r>
     </w:p>
     <w:p>
@@ -2052,7 +2060,7 @@
     </w:p>
     <w:p>
       <w:r>
-        <w:t>Deck reference: Slides 21–30.</w:t>
+        <w:t>Deck reference: Slides 21–33.</w:t>
       </w:r>
     </w:p>
     <w:p>
@@ -3060,12 +3068,315 @@
           <w:color w:val="1F6FEB"/>
           <w:sz w:val="22"/>
         </w:rPr>
-        <w:t>The trend: AI agents build the workflow</w:t>
-      </w:r>
-    </w:p>
-    <w:p>
-      <w:r>
-        <w:t>AI-powered coding tools such as Claude Code and Codex are AI agents themselves, and they have made designing, building and changing workflows fast and cheap. The trend is therefore to use them to CREATE the workflow — describe the process in plain English, let Claude Code or Codex draft the n8n workflow, review and test it — and then let the deterministic workflow RUN the process, with AI nodes only where judgement is needed. The agent's efficiency goes into building, the workflow's determinism into running.</w:t>
+        <w:t>The trend: AI-assisted workflow creation</w:t>
+      </w:r>
+    </w:p>
+    <w:p>
+      <w:r>
+        <w:t>AI-powered coding tools — n8n Assistant inside n8n, and Claude Code and Codex outside it — are AI agents themselves, and they have made designing, building and changing workflows fast and cheap. The trend is AI-ASSISTED WORKFLOW CREATION: describe the process in plain English, let the assistant draft the workflow, review and test it, and then let the deterministic workflow RUN the process, with AI and AI Agent nodes only where judgement is needed. The agent's efficiency goes into building; the workflow's determinism goes into running.</w:t>
+      </w:r>
+    </w:p>
+    <w:p>
+      <w:r>
+        <w:rPr>
+          <w:b/>
+          <w:color w:val="1F6FEB"/>
+          <w:sz w:val="22"/>
+        </w:rPr>
+        <w:t>n8n Assistant — describe it, n8n builds it</w:t>
+      </w:r>
+    </w:p>
+    <w:p>
+      <w:r>
+        <w:t>Open Assistant in the left sidebar of n8n. At the prompt "What do you want to automate?" describe the workflow: what triggers it, which apps it uses, what data it reads and writes, what happens on success and on failure, and whether it should ask before publishing. n8n Assistant plans the workflow, builds it in your project, tests it and helps fix errors. The result is a normal n8n workflow that you open, inspect, edit, test and publish yourself. On n8n Cloud, Assistant chats use the plan's monthly Assistant credits; they are separate from the Gateway credits your workflow's AI nodes use when they run.</w:t>
+      </w:r>
+    </w:p>
+    <w:p>
+      <w:pPr>
+        <w:jc w:val="center"/>
+      </w:pPr>
+      <w:r>
+        <w:drawing>
+          <wp:inline xmlns:a="http://schemas.openxmlformats.org/drawingml/2006/main" xmlns:pic="http://schemas.openxmlformats.org/drawingml/2006/picture">
+            <wp:extent cx="5669280" cy="2721103"/>
+            <wp:docPr id="4" name="Picture 4"/>
+            <wp:cNvGraphicFramePr>
+              <a:graphicFrameLocks noChangeAspect="1"/>
+            </wp:cNvGraphicFramePr>
+            <a:graphic>
+              <a:graphicData uri="http://schemas.openxmlformats.org/drawingml/2006/picture">
+                <pic:pic>
+                  <pic:nvPicPr>
+                    <pic:cNvPr id="0" name="n8n-assistant.png"/>
+                    <pic:cNvPicPr/>
+                  </pic:nvPicPr>
+                  <pic:blipFill>
+                    <a:blip r:embed="rId12"/>
+                    <a:stretch>
+                      <a:fillRect/>
+                    </a:stretch>
+                  </pic:blipFill>
+                  <pic:spPr>
+                    <a:xfrm>
+                      <a:off x="0" y="0"/>
+                      <a:ext cx="5669280" cy="2721103"/>
+                    </a:xfrm>
+                    <a:prstGeom prst="rect"/>
+                  </pic:spPr>
+                </pic:pic>
+              </a:graphicData>
+            </a:graphic>
+          </wp:inline>
+        </w:drawing>
+      </w:r>
+    </w:p>
+    <w:p>
+      <w:pPr>
+        <w:jc w:val="center"/>
+      </w:pPr>
+      <w:r>
+        <w:rPr>
+          <w:i/>
+          <w:color w:val="555B66"/>
+          <w:sz w:val="18"/>
+        </w:rPr>
+        <w:t>n8n Assistant — "What do you want to automate?" Type a prompt, or start from a suggestion such as Score my leads or Schedule social posts.</w:t>
+      </w:r>
+    </w:p>
+    <w:p>
+      <w:r>
+        <w:rPr>
+          <w:b/>
+          <w:color w:val="1F6FEB"/>
+          <w:sz w:val="22"/>
+        </w:rPr>
+        <w:t>Claim your free AI credits</w:t>
+      </w:r>
+    </w:p>
+    <w:p>
+      <w:r>
+        <w:t>The n8n Cloud free trial includes free Gateway credits, which let a node call a supported AI model without a provider account or API key.</w:t>
+      </w:r>
+    </w:p>
+    <w:p>
+      <w:pPr>
+        <w:pStyle w:val="ListNumber"/>
+      </w:pPr>
+      <w:r>
+        <w:t>Sign in to n8n Cloud with your training account.</w:t>
+      </w:r>
+    </w:p>
+    <w:p>
+      <w:pPr>
+        <w:ind w:left="720"/>
+      </w:pPr>
+      <w:r>
+        <w:rPr>
+          <w:b/>
+          <w:i/>
+          <w:color w:val="B4760B"/>
+          <w:sz w:val="19"/>
+        </w:rPr>
+        <w:t xml:space="preserve">Why this step: </w:t>
+      </w:r>
+      <w:r>
+        <w:rPr>
+          <w:i/>
+          <w:color w:val="555B66"/>
+          <w:sz w:val="19"/>
+        </w:rPr>
+        <w:t>The trial's credit balance belongs to that instance.</w:t>
+      </w:r>
+    </w:p>
+    <w:p>
+      <w:pPr>
+        <w:pStyle w:val="ListNumber"/>
+      </w:pPr>
+      <w:r>
+        <w:t>Open a workflow and add an AI node — for example an AI Agent with a Google Gemini or OpenAI Chat Model.</w:t>
+      </w:r>
+    </w:p>
+    <w:p>
+      <w:pPr>
+        <w:pStyle w:val="ListNumber"/>
+      </w:pPr>
+      <w:r>
+        <w:t>In the node's Credential field, select Use Gateway credits. The option shows your remaining balance.</w:t>
+      </w:r>
+    </w:p>
+    <w:p>
+      <w:pPr>
+        <w:ind w:left="720"/>
+      </w:pPr>
+      <w:r>
+        <w:rPr>
+          <w:b/>
+          <w:i/>
+          <w:color w:val="B4760B"/>
+          <w:sz w:val="19"/>
+        </w:rPr>
+        <w:t xml:space="preserve">Why this step: </w:t>
+      </w:r>
+      <w:r>
+        <w:rPr>
+          <w:i/>
+          <w:color w:val="555B66"/>
+          <w:sz w:val="19"/>
+        </w:rPr>
+        <w:t>No API key is pasted anywhere, so none can leak.</w:t>
+      </w:r>
+    </w:p>
+    <w:p>
+      <w:pPr>
+        <w:pStyle w:val="ListNumber"/>
+      </w:pPr>
+      <w:r>
+        <w:t>Pick a supported model, configure the rest of the node as usual, and run it.</w:t>
+      </w:r>
+    </w:p>
+    <w:p>
+      <w:pPr>
+        <w:pStyle w:val="ListNumber"/>
+      </w:pPr>
+      <w:r>
+        <w:t>Track the balance on the node, or in the Admin Panel under Gateway credits.</w:t>
+      </w:r>
+    </w:p>
+    <w:p>
+      <w:pPr>
+        <w:ind w:left="720"/>
+      </w:pPr>
+      <w:r>
+        <w:rPr>
+          <w:b/>
+          <w:i/>
+          <w:color w:val="B4760B"/>
+          <w:sz w:val="19"/>
+        </w:rPr>
+        <w:t xml:space="preserve">Why this step: </w:t>
+      </w:r>
+      <w:r>
+        <w:rPr>
+          <w:i/>
+          <w:color w:val="555B66"/>
+          <w:sz w:val="19"/>
+        </w:rPr>
+        <w:t>When the balance reaches zero, nodes on Gateway credits stop until credit is added or you switch to your own credential.</w:t>
+      </w:r>
+    </w:p>
+    <w:p>
+      <w:r>
+        <w:rPr>
+          <w:b/>
+          <w:color w:val="1F6FEB"/>
+        </w:rPr>
+        <w:t xml:space="preserve">Note: </w:t>
+      </w:r>
+      <w:r>
+        <w:rPr>
+          <w:sz w:val="20"/>
+        </w:rPr>
+        <w:t>If a red toast reads "Free AI credits — Enable to claim credits", that is n8n's legacy one-time OpenAI offer, which is not issued to instances that have Gateway credits. Ignore it and use Use Gateway credits on the node instead.</w:t>
+      </w:r>
+    </w:p>
+    <w:p>
+      <w:r>
+        <w:rPr>
+          <w:b/>
+          <w:color w:val="1F6FEB"/>
+          <w:sz w:val="22"/>
+        </w:rPr>
+        <w:t>Demo: build a social media campaign workflow with n8n Assistant</w:t>
+      </w:r>
+    </w:p>
+    <w:p>
+      <w:r>
+        <w:t>Paste this prompt into n8n Assistant:</w:t>
+      </w:r>
+    </w:p>
+    <w:p>
+      <w:r>
+        <w:rPr>
+          <w:rFonts w:ascii="Consolas" w:hAnsi="Consolas"/>
+          <w:color w:val="0B3060"/>
+          <w:sz w:val="19"/>
+        </w:rPr>
+        <w:t>Create a workflow for a social media marketing campaign:</w:t>
+      </w:r>
+    </w:p>
+    <w:p>
+      <w:r>
+        <w:rPr>
+          <w:rFonts w:ascii="Consolas" w:hAnsi="Consolas"/>
+          <w:color w:val="0B3060"/>
+          <w:sz w:val="19"/>
+        </w:rPr>
+        <w:t>1. Start from a form where I enter a campaign topic.</w:t>
+      </w:r>
+    </w:p>
+    <w:p>
+      <w:r>
+        <w:rPr>
+          <w:rFonts w:ascii="Consolas" w:hAnsi="Consolas"/>
+          <w:color w:val="0B3060"/>
+          <w:sz w:val="19"/>
+        </w:rPr>
+        <w:t>2. Research the topic on the web and summarise 3 key points.</w:t>
+      </w:r>
+    </w:p>
+    <w:p>
+      <w:r>
+        <w:rPr>
+          <w:rFonts w:ascii="Consolas" w:hAnsi="Consolas"/>
+          <w:color w:val="0B3060"/>
+          <w:sz w:val="19"/>
+        </w:rPr>
+        <w:t>3. Draft a LinkedIn post under 150 words from the research.</w:t>
+      </w:r>
+    </w:p>
+    <w:p>
+      <w:r>
+        <w:rPr>
+          <w:rFonts w:ascii="Consolas" w:hAnsi="Consolas"/>
+          <w:color w:val="0B3060"/>
+          <w:sz w:val="19"/>
+        </w:rPr>
+        <w:t>4. Email me the draft and wait for my approval before posting.</w:t>
+      </w:r>
+    </w:p>
+    <w:p>
+      <w:r>
+        <w:rPr>
+          <w:rFonts w:ascii="Consolas" w:hAnsi="Consolas"/>
+          <w:color w:val="0B3060"/>
+          <w:sz w:val="19"/>
+        </w:rPr>
+        <w:t>5. If approved, schedule the post for 9am the next weekday;</w:t>
+      </w:r>
+    </w:p>
+    <w:p>
+      <w:r>
+        <w:rPr>
+          <w:rFonts w:ascii="Consolas" w:hAnsi="Consolas"/>
+          <w:color w:val="0B3060"/>
+          <w:sz w:val="19"/>
+        </w:rPr>
+        <w:t xml:space="preserve">    if rejected, log my feedback in a Google Sheet.</w:t>
+      </w:r>
+    </w:p>
+    <w:p>
+      <w:r>
+        <w:rPr>
+          <w:rFonts w:ascii="Consolas" w:hAnsi="Consolas"/>
+          <w:color w:val="0B3060"/>
+          <w:sz w:val="19"/>
+        </w:rPr>
+        <w:t>Use Gateway credits for the AI model. Ask me before publishing.</w:t>
+      </w:r>
+    </w:p>
+    <w:p>
+      <w:r>
+        <w:t>n8n Assistant plans and builds a five-stage workflow: a Form Trigger where you enter the topic; an AI Agent with a web-search tool that researches it; an AI step that drafts the post; a human-in-the-loop approval (Gmail Send and Wait for Response) so nothing is posted unchecked; and a Wait plus the social node that schedules and publishes the approved post, with rejections logged to a Google Sheet. Then review the plan before it builds, connect Gmail and the social account when it asks, test with a real topic and approve the draft, and publish only when the run looks right. The AI built the workflow; the workflow runs it.</w:t>
       </w:r>
     </w:p>
     <w:p>
@@ -4283,7 +4594,7 @@
     </w:p>
     <w:p>
       <w:r>
-        <w:t>Deck reference: Slides 61–64.</w:t>
+        <w:t>Deck reference: Slides 64–67.</w:t>
       </w:r>
     </w:p>
     <w:p>
@@ -4324,7 +4635,7 @@
         <w:drawing>
           <wp:inline xmlns:a="http://schemas.openxmlformats.org/drawingml/2006/main" xmlns:pic="http://schemas.openxmlformats.org/drawingml/2006/picture">
             <wp:extent cx="5669280" cy="2381098"/>
-            <wp:docPr id="4" name="Picture 4"/>
+            <wp:docPr id="5" name="Picture 5"/>
             <wp:cNvGraphicFramePr>
               <a:graphicFrameLocks noChangeAspect="1"/>
             </wp:cNvGraphicFramePr>
@@ -4336,7 +4647,7 @@
                     <pic:cNvPicPr/>
                   </pic:nvPicPr>
                   <pic:blipFill>
-                    <a:blip r:embed="rId12"/>
+                    <a:blip r:embed="rId13"/>
                     <a:stretch>
                       <a:fillRect/>
                     </a:stretch>
@@ -4376,7 +4687,7 @@
         <w:drawing>
           <wp:inline xmlns:a="http://schemas.openxmlformats.org/drawingml/2006/main" xmlns:pic="http://schemas.openxmlformats.org/drawingml/2006/picture">
             <wp:extent cx="5669280" cy="3188970"/>
-            <wp:docPr id="5" name="Picture 5"/>
+            <wp:docPr id="6" name="Picture 6"/>
             <wp:cNvGraphicFramePr>
               <a:graphicFrameLocks noChangeAspect="1"/>
             </wp:cNvGraphicFramePr>
@@ -4388,7 +4699,7 @@
                     <pic:cNvPicPr/>
                   </pic:nvPicPr>
                   <pic:blipFill>
-                    <a:blip r:embed="rId13"/>
+                    <a:blip r:embed="rId14"/>
                     <a:stretch>
                       <a:fillRect/>
                     </a:stretch>
@@ -4438,7 +4749,7 @@
         <w:drawing>
           <wp:inline xmlns:a="http://schemas.openxmlformats.org/drawingml/2006/main" xmlns:pic="http://schemas.openxmlformats.org/drawingml/2006/picture">
             <wp:extent cx="5669280" cy="2598791"/>
-            <wp:docPr id="6" name="Picture 6"/>
+            <wp:docPr id="7" name="Picture 7"/>
             <wp:cNvGraphicFramePr>
               <a:graphicFrameLocks noChangeAspect="1"/>
             </wp:cNvGraphicFramePr>
@@ -4450,7 +4761,7 @@
                     <pic:cNvPicPr/>
                   </pic:nvPicPr>
                   <pic:blipFill>
-                    <a:blip r:embed="rId14"/>
+                    <a:blip r:embed="rId15"/>
                     <a:stretch>
                       <a:fillRect/>
                     </a:stretch>
@@ -5084,7 +5395,7 @@
     </w:p>
     <w:p>
       <w:r>
-        <w:t>Deck reference: Slides 65–67.</w:t>
+        <w:t>Deck reference: Slides 68–70.</w:t>
       </w:r>
     </w:p>
     <w:p>
@@ -5125,7 +5436,7 @@
         <w:drawing>
           <wp:inline xmlns:a="http://schemas.openxmlformats.org/drawingml/2006/main" xmlns:pic="http://schemas.openxmlformats.org/drawingml/2006/picture">
             <wp:extent cx="5669280" cy="2480310"/>
-            <wp:docPr id="7" name="Picture 7"/>
+            <wp:docPr id="8" name="Picture 8"/>
             <wp:cNvGraphicFramePr>
               <a:graphicFrameLocks noChangeAspect="1"/>
             </wp:cNvGraphicFramePr>
@@ -5137,7 +5448,7 @@
                     <pic:cNvPicPr/>
                   </pic:nvPicPr>
                   <pic:blipFill>
-                    <a:blip r:embed="rId15"/>
+                    <a:blip r:embed="rId16"/>
                     <a:stretch>
                       <a:fillRect/>
                     </a:stretch>
@@ -5187,7 +5498,7 @@
         <w:drawing>
           <wp:inline xmlns:a="http://schemas.openxmlformats.org/drawingml/2006/main" xmlns:pic="http://schemas.openxmlformats.org/drawingml/2006/picture">
             <wp:extent cx="5669280" cy="1738361"/>
-            <wp:docPr id="8" name="Picture 8"/>
+            <wp:docPr id="9" name="Picture 9"/>
             <wp:cNvGraphicFramePr>
               <a:graphicFrameLocks noChangeAspect="1"/>
             </wp:cNvGraphicFramePr>
@@ -5199,7 +5510,7 @@
                     <pic:cNvPicPr/>
                   </pic:nvPicPr>
                   <pic:blipFill>
-                    <a:blip r:embed="rId16"/>
+                    <a:blip r:embed="rId17"/>
                     <a:stretch>
                       <a:fillRect/>
                     </a:stretch>
@@ -5928,7 +6239,7 @@
     </w:p>
     <w:p>
       <w:r>
-        <w:t>Agentic workflows · Chatbots on webhooks · Approval gates · Accountability   (Deck reference: Slides 69–80.)</w:t>
+        <w:t>Agentic workflows · Chatbots on webhooks · Approval gates · Accountability   (Deck reference: Slides 72–83.)</w:t>
       </w:r>
     </w:p>
     <w:p>
@@ -6096,7 +6407,7 @@
     </w:p>
     <w:p>
       <w:r>
-        <w:t>Deck reference: Slides 74–76.</w:t>
+        <w:t>Deck reference: Slides 77–79.</w:t>
       </w:r>
     </w:p>
     <w:p>
@@ -6137,7 +6448,7 @@
         <w:drawing>
           <wp:inline xmlns:a="http://schemas.openxmlformats.org/drawingml/2006/main" xmlns:pic="http://schemas.openxmlformats.org/drawingml/2006/picture">
             <wp:extent cx="5669280" cy="3543300"/>
-            <wp:docPr id="9" name="Picture 9"/>
+            <wp:docPr id="10" name="Picture 10"/>
             <wp:cNvGraphicFramePr>
               <a:graphicFrameLocks noChangeAspect="1"/>
             </wp:cNvGraphicFramePr>
@@ -6149,7 +6460,7 @@
                     <pic:cNvPicPr/>
                   </pic:nvPicPr>
                   <pic:blipFill>
-                    <a:blip r:embed="rId17"/>
+                    <a:blip r:embed="rId18"/>
                     <a:stretch>
                       <a:fillRect/>
                     </a:stretch>
@@ -6199,7 +6510,7 @@
         <w:drawing>
           <wp:inline xmlns:a="http://schemas.openxmlformats.org/drawingml/2006/main" xmlns:pic="http://schemas.openxmlformats.org/drawingml/2006/picture">
             <wp:extent cx="5669280" cy="1984818"/>
-            <wp:docPr id="10" name="Picture 10"/>
+            <wp:docPr id="11" name="Picture 11"/>
             <wp:cNvGraphicFramePr>
               <a:graphicFrameLocks noChangeAspect="1"/>
             </wp:cNvGraphicFramePr>
@@ -6211,7 +6522,7 @@
                     <pic:cNvPicPr/>
                   </pic:nvPicPr>
                   <pic:blipFill>
-                    <a:blip r:embed="rId18"/>
+                    <a:blip r:embed="rId19"/>
                     <a:stretch>
                       <a:fillRect/>
                     </a:stretch>
@@ -6894,7 +7205,7 @@
     </w:p>
     <w:p>
       <w:r>
-        <w:t>Deck reference: Slides 77–79.</w:t>
+        <w:t>Deck reference: Slides 80–82.</w:t>
       </w:r>
     </w:p>
     <w:p>
@@ -6935,7 +7246,7 @@
         <w:drawing>
           <wp:inline xmlns:a="http://schemas.openxmlformats.org/drawingml/2006/main" xmlns:pic="http://schemas.openxmlformats.org/drawingml/2006/picture">
             <wp:extent cx="5669280" cy="3271647"/>
-            <wp:docPr id="11" name="Picture 11"/>
+            <wp:docPr id="12" name="Picture 12"/>
             <wp:cNvGraphicFramePr>
               <a:graphicFrameLocks noChangeAspect="1"/>
             </wp:cNvGraphicFramePr>
@@ -6947,7 +7258,7 @@
                     <pic:cNvPicPr/>
                   </pic:nvPicPr>
                   <pic:blipFill>
-                    <a:blip r:embed="rId19"/>
+                    <a:blip r:embed="rId20"/>
                     <a:stretch>
                       <a:fillRect/>
                     </a:stretch>
@@ -6997,7 +7308,7 @@
         <w:drawing>
           <wp:inline xmlns:a="http://schemas.openxmlformats.org/drawingml/2006/main" xmlns:pic="http://schemas.openxmlformats.org/drawingml/2006/picture">
             <wp:extent cx="5669280" cy="1751834"/>
-            <wp:docPr id="12" name="Picture 12"/>
+            <wp:docPr id="13" name="Picture 13"/>
             <wp:cNvGraphicFramePr>
               <a:graphicFrameLocks noChangeAspect="1"/>
             </wp:cNvGraphicFramePr>
@@ -7009,7 +7320,7 @@
                     <pic:cNvPicPr/>
                   </pic:nvPicPr>
                   <pic:blipFill>
-                    <a:blip r:embed="rId20"/>
+                    <a:blip r:embed="rId21"/>
                     <a:stretch>
                       <a:fillRect/>
                     </a:stretch>
@@ -7808,7 +8119,7 @@
     </w:p>
     <w:p>
       <w:r>
-        <w:t>Tokenization · Embeddings · Vector stores · Grounded answers   (Deck reference: Slides 81–93.)</w:t>
+        <w:t>Tokenization · Embeddings · Vector stores · Grounded answers   (Deck reference: Slides 84–96.)</w:t>
       </w:r>
     </w:p>
     <w:p>
@@ -7927,7 +8238,7 @@
         <w:drawing>
           <wp:inline xmlns:a="http://schemas.openxmlformats.org/drawingml/2006/main" xmlns:pic="http://schemas.openxmlformats.org/drawingml/2006/picture">
             <wp:extent cx="5669280" cy="2914918"/>
-            <wp:docPr id="13" name="Picture 13"/>
+            <wp:docPr id="14" name="Picture 14"/>
             <wp:cNvGraphicFramePr>
               <a:graphicFrameLocks noChangeAspect="1"/>
             </wp:cNvGraphicFramePr>
@@ -7939,7 +8250,7 @@
                     <pic:cNvPicPr/>
                   </pic:nvPicPr>
                   <pic:blipFill>
-                    <a:blip r:embed="rId21"/>
+                    <a:blip r:embed="rId22"/>
                     <a:stretch>
                       <a:fillRect/>
                     </a:stretch>
@@ -7979,7 +8290,7 @@
         <w:drawing>
           <wp:inline xmlns:a="http://schemas.openxmlformats.org/drawingml/2006/main" xmlns:pic="http://schemas.openxmlformats.org/drawingml/2006/picture">
             <wp:extent cx="5669280" cy="1774418"/>
-            <wp:docPr id="14" name="Picture 14"/>
+            <wp:docPr id="15" name="Picture 15"/>
             <wp:cNvGraphicFramePr>
               <a:graphicFrameLocks noChangeAspect="1"/>
             </wp:cNvGraphicFramePr>
@@ -7991,7 +8302,7 @@
                     <pic:cNvPicPr/>
                   </pic:nvPicPr>
                   <pic:blipFill>
-                    <a:blip r:embed="rId22"/>
+                    <a:blip r:embed="rId23"/>
                     <a:stretch>
                       <a:fillRect/>
                     </a:stretch>
@@ -8031,7 +8342,7 @@
         <w:drawing>
           <wp:inline xmlns:a="http://schemas.openxmlformats.org/drawingml/2006/main" xmlns:pic="http://schemas.openxmlformats.org/drawingml/2006/picture">
             <wp:extent cx="5669280" cy="3188970"/>
-            <wp:docPr id="15" name="Picture 15"/>
+            <wp:docPr id="16" name="Picture 16"/>
             <wp:cNvGraphicFramePr>
               <a:graphicFrameLocks noChangeAspect="1"/>
             </wp:cNvGraphicFramePr>
@@ -8043,7 +8354,7 @@
                     <pic:cNvPicPr/>
                   </pic:nvPicPr>
                   <pic:blipFill>
-                    <a:blip r:embed="rId23"/>
+                    <a:blip r:embed="rId24"/>
                     <a:stretch>
                       <a:fillRect/>
                     </a:stretch>
@@ -8090,7 +8401,7 @@
     </w:p>
     <w:p>
       <w:r>
-        <w:t>Deck reference: Slides 90–93.</w:t>
+        <w:t>Deck reference: Slides 93–96.</w:t>
       </w:r>
     </w:p>
     <w:p>
@@ -8131,7 +8442,7 @@
         <w:drawing>
           <wp:inline xmlns:a="http://schemas.openxmlformats.org/drawingml/2006/main" xmlns:pic="http://schemas.openxmlformats.org/drawingml/2006/picture">
             <wp:extent cx="5669280" cy="3543300"/>
-            <wp:docPr id="16" name="Picture 16"/>
+            <wp:docPr id="17" name="Picture 17"/>
             <wp:cNvGraphicFramePr>
               <a:graphicFrameLocks noChangeAspect="1"/>
             </wp:cNvGraphicFramePr>
@@ -8143,7 +8454,7 @@
                     <pic:cNvPicPr/>
                   </pic:nvPicPr>
                   <pic:blipFill>
-                    <a:blip r:embed="rId24"/>
+                    <a:blip r:embed="rId25"/>
                     <a:stretch>
                       <a:fillRect/>
                     </a:stretch>
@@ -8193,7 +8504,7 @@
         <w:drawing>
           <wp:inline xmlns:a="http://schemas.openxmlformats.org/drawingml/2006/main" xmlns:pic="http://schemas.openxmlformats.org/drawingml/2006/picture">
             <wp:extent cx="5669280" cy="1978033"/>
-            <wp:docPr id="17" name="Picture 17"/>
+            <wp:docPr id="18" name="Picture 18"/>
             <wp:cNvGraphicFramePr>
               <a:graphicFrameLocks noChangeAspect="1"/>
             </wp:cNvGraphicFramePr>
@@ -8205,7 +8516,7 @@
                     <pic:cNvPicPr/>
                   </pic:nvPicPr>
                   <pic:blipFill>
-                    <a:blip r:embed="rId25"/>
+                    <a:blip r:embed="rId26"/>
                     <a:stretch>
                       <a:fillRect/>
                     </a:stretch>
@@ -8245,7 +8556,7 @@
         <w:drawing>
           <wp:inline xmlns:a="http://schemas.openxmlformats.org/drawingml/2006/main" xmlns:pic="http://schemas.openxmlformats.org/drawingml/2006/picture">
             <wp:extent cx="5669280" cy="2134729"/>
-            <wp:docPr id="18" name="Picture 18"/>
+            <wp:docPr id="19" name="Picture 19"/>
             <wp:cNvGraphicFramePr>
               <a:graphicFrameLocks noChangeAspect="1"/>
             </wp:cNvGraphicFramePr>
@@ -8257,7 +8568,7 @@
                     <pic:cNvPicPr/>
                   </pic:nvPicPr>
                   <pic:blipFill>
-                    <a:blip r:embed="rId26"/>
+                    <a:blip r:embed="rId27"/>
                     <a:stretch>
                       <a:fillRect/>
                     </a:stretch>
@@ -9479,7 +9790,7 @@
       </w:r>
     </w:p>
     <w:sectPr>
-      <w:footerReference w:type="default" r:id="rId27"/>
+      <w:footerReference w:type="default" r:id="rId28"/>
       <w:pgSz w:w="12240" w:h="15840"/>
       <w:pgMar w:top="1440" w:right="1800" w:bottom="1440" w:left="1800" w:header="720" w:footer="720" w:gutter="0"/>
       <w:cols w:space="720"/>

</xml_diff>

<commit_message>
feat(courseware): training accounts and sign-in steps move into Topic 1
The n8n Training Accounts slide moves from the admin block to Topic 1,
followed by a new Sign In to n8n slide, both just before the free AI
credits and the n8n Assistant demo. Sign-in steps mirrored in the
Learner Guide; README topics updated.

Co-Authored-By: Claude Opus 5.5 <noreply@anthropic.com>
</commit_message>
<xml_diff>
--- a/courseware/LG-Agentic AI for Business Process Automation.docx
+++ b/courseware/LG-Agentic AI for Business Process Automation.docx
@@ -2047,7 +2047,7 @@
     </w:p>
     <w:p>
       <w:r>
-        <w:t>Why agentic AI · Workflow first · Triggers &amp; actions · LLM agents · Webhooks   (Deck reference: Slides 21–71.)</w:t>
+        <w:t>Why agentic AI · Workflow first · Triggers &amp; actions · LLM agents · Webhooks   (Deck reference: Slides 20–72.)</w:t>
       </w:r>
     </w:p>
     <w:p>
@@ -2060,7 +2060,7 @@
     </w:p>
     <w:p>
       <w:r>
-        <w:t>Deck reference: Slides 21–33.</w:t>
+        <w:t>Deck reference: Slides 20–34.</w:t>
       </w:r>
     </w:p>
     <w:p>
@@ -3150,6 +3150,83 @@
           <w:color w:val="1F6FEB"/>
           <w:sz w:val="22"/>
         </w:rPr>
+        <w:t>Sign in to n8n</w:t>
+      </w:r>
+    </w:p>
+    <w:p>
+      <w:r>
+        <w:t>Each learner has one pre-created n8n Cloud account (n8n18oct1 to n8n18oct12@tertiaryinfotech.com); the trainer gives you yours and its password in class. The account name is the email prefix, onboarding is already complete, and each instance is a free 14-day trial that stays active through the training.</w:t>
+      </w:r>
+    </w:p>
+    <w:p>
+      <w:pPr>
+        <w:pStyle w:val="ListNumber"/>
+      </w:pPr>
+      <w:r>
+        <w:t>Go to https://app.n8n.cloud/login — or open your instance URL directly.</w:t>
+      </w:r>
+    </w:p>
+    <w:p>
+      <w:pPr>
+        <w:pStyle w:val="ListNumber"/>
+      </w:pPr>
+      <w:r>
+        <w:t>Enter your assigned account email, for example n8n18oct5@tertiaryinfotech.com.</w:t>
+      </w:r>
+    </w:p>
+    <w:p>
+      <w:pPr>
+        <w:pStyle w:val="ListNumber"/>
+      </w:pPr>
+      <w:r>
+        <w:t>Enter the password your trainer gives you.</w:t>
+      </w:r>
+    </w:p>
+    <w:p>
+      <w:pPr>
+        <w:ind w:left="720"/>
+      </w:pPr>
+      <w:r>
+        <w:rPr>
+          <w:b/>
+          <w:i/>
+          <w:color w:val="B4760B"/>
+          <w:sz w:val="19"/>
+        </w:rPr>
+        <w:t xml:space="preserve">Why this step: </w:t>
+      </w:r>
+      <w:r>
+        <w:rPr>
+          <w:i/>
+          <w:color w:val="555B66"/>
+          <w:sz w:val="19"/>
+        </w:rPr>
+        <w:t>Do not change it — the account is reused for later classes.</w:t>
+      </w:r>
+    </w:p>
+    <w:p>
+      <w:pPr>
+        <w:pStyle w:val="ListNumber"/>
+      </w:pPr>
+      <w:r>
+        <w:t>Open your instance from the dashboard.</w:t>
+      </w:r>
+    </w:p>
+    <w:p>
+      <w:pPr>
+        <w:pStyle w:val="ListNumber"/>
+      </w:pPr>
+      <w:r>
+        <w:t>You land in n8n. Open Assistant or Overview to start building.</w:t>
+      </w:r>
+    </w:p>
+    <w:p>
+      <w:r>
+        <w:rPr>
+          <w:b/>
+          <w:color w:val="1F6FEB"/>
+          <w:sz w:val="22"/>
+        </w:rPr>
         <w:t>Claim your free AI credits</w:t>
       </w:r>
     </w:p>
@@ -4594,7 +4671,7 @@
     </w:p>
     <w:p>
       <w:r>
-        <w:t>Deck reference: Slides 64–67.</w:t>
+        <w:t>Deck reference: Slides 65–68.</w:t>
       </w:r>
     </w:p>
     <w:p>
@@ -5395,7 +5472,7 @@
     </w:p>
     <w:p>
       <w:r>
-        <w:t>Deck reference: Slides 68–70.</w:t>
+        <w:t>Deck reference: Slides 69–71.</w:t>
       </w:r>
     </w:p>
     <w:p>
@@ -6239,7 +6316,7 @@
     </w:p>
     <w:p>
       <w:r>
-        <w:t>Agentic workflows · Chatbots on webhooks · Approval gates · Accountability   (Deck reference: Slides 72–83.)</w:t>
+        <w:t>Agentic workflows · Chatbots on webhooks · Approval gates · Accountability   (Deck reference: Slides 73–84.)</w:t>
       </w:r>
     </w:p>
     <w:p>
@@ -6407,7 +6484,7 @@
     </w:p>
     <w:p>
       <w:r>
-        <w:t>Deck reference: Slides 77–79.</w:t>
+        <w:t>Deck reference: Slides 78–80.</w:t>
       </w:r>
     </w:p>
     <w:p>
@@ -7205,7 +7282,7 @@
     </w:p>
     <w:p>
       <w:r>
-        <w:t>Deck reference: Slides 80–82.</w:t>
+        <w:t>Deck reference: Slides 81–83.</w:t>
       </w:r>
     </w:p>
     <w:p>
@@ -8119,7 +8196,7 @@
     </w:p>
     <w:p>
       <w:r>
-        <w:t>Tokenization · Embeddings · Vector stores · Grounded answers   (Deck reference: Slides 84–96.)</w:t>
+        <w:t>Tokenization · Embeddings · Vector stores · Grounded answers   (Deck reference: Slides 85–97.)</w:t>
       </w:r>
     </w:p>
     <w:p>
@@ -8401,7 +8478,7 @@
     </w:p>
     <w:p>
       <w:r>
-        <w:t>Deck reference: Slides 93–96.</w:t>
+        <w:t>Deck reference: Slides 94–97.</w:t>
       </w:r>
     </w:p>
     <w:p>

</xml_diff>

<commit_message>
feat(courseware): What Is n8n opens the Topic 1 hands-on block
Move What Is n8n? and Every Workflow Is the Same Shape to just before the
training accounts, and describe n8n as a workflow-first agentic AI
platform (deck and Learner Guide).

Co-Authored-By: Claude Opus 5.5 <noreply@anthropic.com>
</commit_message>
<xml_diff>
--- a/courseware/LG-Agentic AI for Business Process Automation.docx
+++ b/courseware/LG-Agentic AI for Business Process Automation.docx
@@ -2060,7 +2060,7 @@
     </w:p>
     <w:p>
       <w:r>
-        <w:t>Deck reference: Slides 20–34.</w:t>
+        <w:t>Deck reference: Slides 20–36.</w:t>
       </w:r>
     </w:p>
     <w:p>
@@ -4373,7 +4373,7 @@
         <w:t xml:space="preserve">What is n8n — </w:t>
       </w:r>
       <w:r>
-        <w:t>n8n is a fair-code workflow automation platform. You drag nodes onto a visual canvas and wire them together to move data between more than 400 applications, with little or no code. Every node shows its input and output as JSON, so you can see exactly what is flowing through. Workflows are plain JSON files you can export, version and share.</w:t>
+        <w:t>n8n is a fair-code, workflow-first agentic AI platform: the workflow owns the path, and AI and AI Agent nodes sit inside it. You drag nodes onto a visual canvas and wire them together to move data between more than 400 applications, with little or no code. Every node shows its input and output as JSON, so you can see exactly what is flowing through. Workflows are plain JSON files you can export, version and share.</w:t>
       </w:r>
     </w:p>
     <w:p>

</xml_diff>